<commit_message>
Actualizacion campos de datos sin imagenes
</commit_message>
<xml_diff>
--- a/Inputs/Templates/GRI BBVA.docx
+++ b/Inputs/Templates/GRI BBVA.docx
@@ -195,7 +195,6 @@
                 <w:sz w:val="32"/>
               </w:rPr>
             </w:pPr>
-            <w:proofErr w:type="gramStart"/>
             <w:r>
               <w:rPr>
                 <w:color w:val="767171" w:themeColor="background2" w:themeShade="80"/>
@@ -209,15 +208,7 @@
                 <w:color w:val="767171" w:themeColor="background2" w:themeShade="80"/>
                 <w:sz w:val="32"/>
               </w:rPr>
-              <w:t>nombre</w:t>
-            </w:r>
-            <w:proofErr w:type="gramEnd"/>
-            <w:r>
-              <w:rPr>
-                <w:color w:val="767171" w:themeColor="background2" w:themeShade="80"/>
-                <w:sz w:val="32"/>
-              </w:rPr>
-              <w:t>_comercial</w:t>
+              <w:t>nombre_comercial</w:t>
             </w:r>
             <w:proofErr w:type="spellEnd"/>
             <w:r>
@@ -245,30 +236,20 @@
                 <w:sz w:val="32"/>
               </w:rPr>
             </w:pPr>
-            <w:proofErr w:type="gramStart"/>
             <w:r>
               <w:rPr>
                 <w:color w:val="767171" w:themeColor="background2" w:themeShade="80"/>
                 <w:sz w:val="32"/>
               </w:rPr>
-              <w:t>{{ calle</w:t>
+              <w:t>{{ calle }}</w:t>
             </w:r>
-            <w:proofErr w:type="gramEnd"/>
             <w:r>
               <w:rPr>
                 <w:color w:val="767171" w:themeColor="background2" w:themeShade="80"/>
                 <w:sz w:val="32"/>
               </w:rPr>
-              <w:t xml:space="preserve"> }}</w:t>
-            </w:r>
-            <w:r>
-              <w:rPr>
-                <w:color w:val="767171" w:themeColor="background2" w:themeShade="80"/>
-                <w:sz w:val="32"/>
-              </w:rPr>
               <w:t xml:space="preserve"> No. </w:t>
             </w:r>
-            <w:proofErr w:type="gramStart"/>
             <w:r>
               <w:rPr>
                 <w:color w:val="767171" w:themeColor="background2" w:themeShade="80"/>
@@ -282,15 +263,7 @@
                 <w:color w:val="767171" w:themeColor="background2" w:themeShade="80"/>
                 <w:sz w:val="32"/>
               </w:rPr>
-              <w:t>no</w:t>
-            </w:r>
-            <w:proofErr w:type="gramEnd"/>
-            <w:r>
-              <w:rPr>
-                <w:color w:val="767171" w:themeColor="background2" w:themeShade="80"/>
-                <w:sz w:val="32"/>
-              </w:rPr>
-              <w:t>_exterior</w:t>
+              <w:t>no_exterior</w:t>
             </w:r>
             <w:proofErr w:type="spellEnd"/>
             <w:r>
@@ -417,7 +390,6 @@
                 <w:color w:val="2A86CA"/>
               </w:rPr>
             </w:pPr>
-            <w:proofErr w:type="gramStart"/>
             <w:r>
               <w:rPr>
                 <w:b/>
@@ -434,7 +406,6 @@
               <w:t>dia</w:t>
             </w:r>
             <w:proofErr w:type="spellEnd"/>
-            <w:proofErr w:type="gramEnd"/>
             <w:r>
               <w:rPr>
                 <w:b/>
@@ -957,13 +928,8 @@
         <w:spacing w:before="0" w:line="360" w:lineRule="auto"/>
         <w:jc w:val="both"/>
       </w:pPr>
-      <w:proofErr w:type="gramStart"/>
-      <w:r>
-        <w:t>De acuerdo a</w:t>
-      </w:r>
-      <w:proofErr w:type="gramEnd"/>
-      <w:r>
-        <w:t xml:space="preserve"> las referencias indicadas en Tabla A.1 de la norma de referencia, sirva de base de acuerdo a los materiales y sustancias químicas almacenadas en la empresa.</w:t>
+      <w:r>
+        <w:t>De acuerdo a las referencias indicadas en Tabla A.1 de la norma de referencia, sirva de base de acuerdo a los materiales y sustancias químicas almacenadas en la empresa.</w:t>
       </w:r>
     </w:p>
     <w:p>
@@ -3809,7 +3775,7 @@
                       <w:sz w:val="26"/>
                       <w:szCs w:val="26"/>
                     </w:rPr>
-                    <m:t>{{ valor_gi }}</m:t>
+                    <m:t>{{ gas_inflamable }}</m:t>
                   </m:r>
                 </m:num>
                 <m:den>
@@ -3822,29 +3788,7 @@
                       <w:sz w:val="26"/>
                       <w:szCs w:val="26"/>
                     </w:rPr>
-                    <m:t>3000</m:t>
-                  </m:r>
-                  <m:r>
-                    <m:rPr>
-                      <m:sty m:val="bi"/>
-                    </m:rPr>
-                    <w:rPr>
-                      <w:rFonts w:ascii="Cambria Math" w:hAnsi="Cambria Math"/>
-                      <w:sz w:val="26"/>
-                      <w:szCs w:val="26"/>
-                    </w:rPr>
-                    <m:t xml:space="preserve"> </m:t>
-                  </m:r>
-                  <m:r>
-                    <m:rPr>
-                      <m:sty m:val="bi"/>
-                    </m:rPr>
-                    <w:rPr>
-                      <w:rFonts w:ascii="Cambria Math" w:hAnsi="Cambria Math"/>
-                      <w:sz w:val="26"/>
-                      <w:szCs w:val="26"/>
-                    </w:rPr>
-                    <m:t>litros</m:t>
+                    <m:t>3000 litros</m:t>
                   </m:r>
                 </m:den>
               </m:f>
@@ -3896,7 +3840,7 @@
                       <w:sz w:val="26"/>
                       <w:szCs w:val="26"/>
                     </w:rPr>
-                    <m:t>0</m:t>
+                    <m:t>{{ liquido_inflamable }}</m:t>
                   </m:r>
                 </m:num>
                 <m:den>
@@ -3909,29 +3853,7 @@
                       <w:sz w:val="26"/>
                       <w:szCs w:val="26"/>
                     </w:rPr>
-                    <m:t>1400</m:t>
-                  </m:r>
-                  <m:r>
-                    <m:rPr>
-                      <m:sty m:val="bi"/>
-                    </m:rPr>
-                    <w:rPr>
-                      <w:rFonts w:ascii="Cambria Math" w:hAnsi="Cambria Math"/>
-                      <w:sz w:val="26"/>
-                      <w:szCs w:val="26"/>
-                    </w:rPr>
-                    <m:t xml:space="preserve"> </m:t>
-                  </m:r>
-                  <m:r>
-                    <m:rPr>
-                      <m:sty m:val="bi"/>
-                    </m:rPr>
-                    <w:rPr>
-                      <w:rFonts w:ascii="Cambria Math" w:hAnsi="Cambria Math"/>
-                      <w:sz w:val="26"/>
-                      <w:szCs w:val="26"/>
-                    </w:rPr>
-                    <m:t>litros</m:t>
+                    <m:t>1400 litros</m:t>
                   </m:r>
                 </m:den>
               </m:f>
@@ -3983,7 +3905,7 @@
                       <w:sz w:val="26"/>
                       <w:szCs w:val="26"/>
                     </w:rPr>
-                    <m:t>0</m:t>
+                    <m:t>{{ liquido_combustible }}</m:t>
                   </m:r>
                 </m:num>
                 <m:den>
@@ -3996,29 +3918,7 @@
                       <w:sz w:val="26"/>
                       <w:szCs w:val="26"/>
                     </w:rPr>
-                    <m:t>2000</m:t>
-                  </m:r>
-                  <m:r>
-                    <m:rPr>
-                      <m:sty m:val="bi"/>
-                    </m:rPr>
-                    <w:rPr>
-                      <w:rFonts w:ascii="Cambria Math" w:hAnsi="Cambria Math"/>
-                      <w:sz w:val="26"/>
-                      <w:szCs w:val="26"/>
-                    </w:rPr>
-                    <m:t xml:space="preserve"> </m:t>
-                  </m:r>
-                  <m:r>
-                    <m:rPr>
-                      <m:sty m:val="bi"/>
-                    </m:rPr>
-                    <w:rPr>
-                      <w:rFonts w:ascii="Cambria Math" w:hAnsi="Cambria Math"/>
-                      <w:sz w:val="26"/>
-                      <w:szCs w:val="26"/>
-                    </w:rPr>
-                    <m:t>litros</m:t>
+                    <m:t>2000 litros</m:t>
                   </m:r>
                 </m:den>
               </m:f>
@@ -4070,7 +3970,7 @@
                       <w:sz w:val="26"/>
                       <w:szCs w:val="26"/>
                     </w:rPr>
-                    <m:t>720</m:t>
+                    <m:t>{{ solido_combusible }</m:t>
                   </m:r>
                   <m:r>
                     <m:rPr>
@@ -4081,7 +3981,7 @@
                       <w:sz w:val="26"/>
                       <w:szCs w:val="26"/>
                     </w:rPr>
-                    <m:t xml:space="preserve"> </m:t>
+                    <m:t>}</m:t>
                   </m:r>
                   <m:r>
                     <m:rPr>
@@ -4092,7 +3992,7 @@
                       <w:sz w:val="26"/>
                       <w:szCs w:val="26"/>
                     </w:rPr>
-                    <m:t>kg</m:t>
+                    <m:t xml:space="preserve"> kg</m:t>
                   </m:r>
                 </m:num>
                 <m:den>
@@ -4105,29 +4005,7 @@
                       <w:sz w:val="26"/>
                       <w:szCs w:val="26"/>
                     </w:rPr>
-                    <m:t>15000</m:t>
-                  </m:r>
-                  <m:r>
-                    <m:rPr>
-                      <m:sty m:val="bi"/>
-                    </m:rPr>
-                    <w:rPr>
-                      <w:rFonts w:ascii="Cambria Math" w:hAnsi="Cambria Math"/>
-                      <w:sz w:val="26"/>
-                      <w:szCs w:val="26"/>
-                    </w:rPr>
-                    <m:t xml:space="preserve"> </m:t>
-                  </m:r>
-                  <m:r>
-                    <m:rPr>
-                      <m:sty m:val="bi"/>
-                    </m:rPr>
-                    <w:rPr>
-                      <w:rFonts w:ascii="Cambria Math" w:hAnsi="Cambria Math"/>
-                      <w:sz w:val="26"/>
-                      <w:szCs w:val="26"/>
-                    </w:rPr>
-                    <m:t>kg</m:t>
+                    <m:t>15000 kg</m:t>
                   </m:r>
                 </m:den>
               </m:f>
@@ -4153,29 +4031,7 @@
               <w:sz w:val="26"/>
               <w:szCs w:val="26"/>
             </w:rPr>
-            <m:t>0</m:t>
-          </m:r>
-          <m:r>
-            <m:rPr>
-              <m:sty m:val="bi"/>
-            </m:rPr>
-            <w:rPr>
-              <w:rFonts w:ascii="Cambria Math" w:hAnsi="Cambria Math"/>
-              <w:sz w:val="26"/>
-              <w:szCs w:val="26"/>
-            </w:rPr>
-            <m:t>.</m:t>
-          </m:r>
-          <m:r>
-            <m:rPr>
-              <m:sty m:val="bi"/>
-            </m:rPr>
-            <w:rPr>
-              <w:rFonts w:ascii="Cambria Math" w:hAnsi="Cambria Math"/>
-              <w:sz w:val="26"/>
-              <w:szCs w:val="26"/>
-            </w:rPr>
-            <m:t>048</m:t>
+            <m:t>{{ valor_gri }}</m:t>
           </m:r>
         </m:oMath>
       </m:oMathPara>
@@ -4212,7 +4068,7 @@
           <w:b/>
           <w:bCs/>
         </w:rPr>
-        <w:t>valor_sc</w:t>
+        <w:t>valor_gri</w:t>
       </w:r>
       <w:proofErr w:type="spellEnd"/>
       <w:r>
@@ -4939,6 +4795,7 @@
           <w:rFonts w:eastAsia="Arial Unicode MS"/>
           <w:color w:val="000000"/>
         </w:rPr>
+        <w:lastRenderedPageBreak/>
         <w:t>Programa de capacitación en prevención de incendios y atención a emergencias</w:t>
       </w:r>
     </w:p>
@@ -5792,6 +5649,7 @@
           <w:bCs/>
           <w:color w:val="000000"/>
         </w:rPr>
+        <w:lastRenderedPageBreak/>
         <w:t xml:space="preserve">Se deberán </w:t>
       </w:r>
       <w:r>
@@ -6189,6 +6047,7 @@
           <w:i/>
           <w:u w:val="single"/>
         </w:rPr>
+        <w:lastRenderedPageBreak/>
         <w:br w:type="page"/>
       </w:r>
     </w:p>
@@ -10059,6 +9918,13 @@
       <w:r>
         <w:continuationSeparator/>
       </w:r>
+    </w:p>
+  </w:endnote>
+  <w:endnote w:type="continuationNotice" w:id="1">
+    <w:p>
+      <w:pPr>
+        <w:spacing w:before="0"/>
+      </w:pPr>
     </w:p>
   </w:endnote>
 </w:endnotes>
@@ -10156,6 +10022,13 @@
       </w:r>
     </w:p>
   </w:footnote>
+  <w:footnote w:type="continuationNotice" w:id="1">
+    <w:p>
+      <w:pPr>
+        <w:spacing w:before="0"/>
+      </w:pPr>
+    </w:p>
+  </w:footnote>
 </w:footnotes>
 </file>
 
@@ -10205,7 +10078,7 @@
               <w:noProof/>
             </w:rPr>
             <w:drawing>
-              <wp:anchor distT="0" distB="0" distL="114300" distR="114300" simplePos="0" relativeHeight="251659264" behindDoc="1" locked="0" layoutInCell="1" allowOverlap="1" wp14:anchorId="7CD61D3C" wp14:editId="3D2C7D2F">
+              <wp:anchor distT="0" distB="0" distL="114300" distR="114300" simplePos="0" relativeHeight="251658240" behindDoc="1" locked="0" layoutInCell="1" allowOverlap="1" wp14:anchorId="7CD61D3C" wp14:editId="3D2C7D2F">
                 <wp:simplePos x="0" y="0"/>
                 <wp:positionH relativeFrom="column">
                   <wp:posOffset>198546</wp:posOffset>
@@ -10290,7 +10163,6 @@
               <w:szCs w:val="18"/>
             </w:rPr>
           </w:pPr>
-          <w:proofErr w:type="gramStart"/>
           <w:r>
             <w:rPr>
               <w:b/>
@@ -10306,16 +10178,7 @@
               <w:sz w:val="18"/>
               <w:szCs w:val="18"/>
             </w:rPr>
-            <w:t>nombre</w:t>
-          </w:r>
-          <w:proofErr w:type="gramEnd"/>
-          <w:r>
-            <w:rPr>
-              <w:b/>
-              <w:sz w:val="18"/>
-              <w:szCs w:val="18"/>
-            </w:rPr>
-            <w:t>_comercial</w:t>
+            <w:t>nombre_comercial</w:t>
           </w:r>
           <w:proofErr w:type="spellEnd"/>
           <w:r>
@@ -10338,7 +10201,6 @@
             </w:rPr>
           </w:pPr>
           <w:bookmarkStart w:id="9" w:name="_Hlk161747440"/>
-          <w:proofErr w:type="gramStart"/>
           <w:r>
             <w:rPr>
               <w:b/>
@@ -10357,7 +10219,6 @@
             <w:t>dia</w:t>
           </w:r>
           <w:proofErr w:type="spellEnd"/>
-          <w:proofErr w:type="gramEnd"/>
           <w:r>
             <w:rPr>
               <w:b/>
@@ -10401,7 +10262,6 @@
               <w:szCs w:val="18"/>
             </w:rPr>
           </w:pPr>
-          <w:proofErr w:type="gramStart"/>
           <w:r>
             <w:rPr>
               <w:b/>
@@ -10417,16 +10277,7 @@
               <w:sz w:val="18"/>
               <w:szCs w:val="18"/>
             </w:rPr>
-            <w:t>registro</w:t>
-          </w:r>
-          <w:proofErr w:type="gramEnd"/>
-          <w:r>
-            <w:rPr>
-              <w:b/>
-              <w:sz w:val="18"/>
-              <w:szCs w:val="18"/>
-            </w:rPr>
-            <w:t>_perito</w:t>
+            <w:t>registro_perito</w:t>
           </w:r>
           <w:proofErr w:type="spellEnd"/>
           <w:r>
@@ -10448,7 +10299,6 @@
               <w:szCs w:val="18"/>
             </w:rPr>
           </w:pPr>
-          <w:proofErr w:type="gramStart"/>
           <w:r>
             <w:rPr>
               <w:b/>
@@ -10464,16 +10314,7 @@
               <w:sz w:val="18"/>
               <w:szCs w:val="18"/>
             </w:rPr>
-            <w:t>no</w:t>
-          </w:r>
-          <w:proofErr w:type="gramEnd"/>
-          <w:r>
-            <w:rPr>
-              <w:b/>
-              <w:sz w:val="18"/>
-              <w:szCs w:val="18"/>
-            </w:rPr>
-            <w:t>_registro</w:t>
+            <w:t>no_registro</w:t>
           </w:r>
           <w:proofErr w:type="spellEnd"/>
           <w:r>

</xml_diff>

<commit_message>
Correccion detalles a plantillas BBVA
</commit_message>
<xml_diff>
--- a/Inputs/Templates/GRI BBVA.docx
+++ b/Inputs/Templates/GRI BBVA.docx
@@ -271,7 +271,21 @@
                 <w:color w:val="767171" w:themeColor="background2" w:themeShade="80"/>
                 <w:sz w:val="32"/>
               </w:rPr>
-              <w:t xml:space="preserve"> }}{{ </w:t>
+              <w:t xml:space="preserve"> }}</w:t>
+            </w:r>
+            <w:r>
+              <w:rPr>
+                <w:color w:val="767171" w:themeColor="background2" w:themeShade="80"/>
+                <w:sz w:val="32"/>
+              </w:rPr>
+              <w:t xml:space="preserve"> </w:t>
+            </w:r>
+            <w:r>
+              <w:rPr>
+                <w:color w:val="767171" w:themeColor="background2" w:themeShade="80"/>
+                <w:sz w:val="32"/>
+              </w:rPr>
+              <w:t xml:space="preserve">{{ </w:t>
             </w:r>
             <w:proofErr w:type="spellStart"/>
             <w:r>
@@ -2545,7 +2559,21 @@
           <w:b/>
           <w:bCs/>
         </w:rPr>
-        <w:t xml:space="preserve"> }}{{ </w:t>
+        <w:t xml:space="preserve"> }}</w:t>
+      </w:r>
+      <w:r>
+        <w:rPr>
+          <w:b/>
+          <w:bCs/>
+        </w:rPr>
+        <w:t xml:space="preserve"> </w:t>
+      </w:r>
+      <w:r>
+        <w:rPr>
+          <w:b/>
+          <w:bCs/>
+        </w:rPr>
+        <w:t xml:space="preserve">{{ </w:t>
       </w:r>
       <w:proofErr w:type="spellStart"/>
       <w:r>
@@ -3970,29 +3998,7 @@
                       <w:sz w:val="26"/>
                       <w:szCs w:val="26"/>
                     </w:rPr>
-                    <m:t>{{ solido_combusible }</m:t>
-                  </m:r>
-                  <m:r>
-                    <m:rPr>
-                      <m:sty m:val="bi"/>
-                    </m:rPr>
-                    <w:rPr>
-                      <w:rFonts w:ascii="Cambria Math" w:hAnsi="Cambria Math"/>
-                      <w:sz w:val="26"/>
-                      <w:szCs w:val="26"/>
-                    </w:rPr>
-                    <m:t>}</m:t>
-                  </m:r>
-                  <m:r>
-                    <m:rPr>
-                      <m:sty m:val="bi"/>
-                    </m:rPr>
-                    <w:rPr>
-                      <w:rFonts w:ascii="Cambria Math" w:hAnsi="Cambria Math"/>
-                      <w:sz w:val="26"/>
-                      <w:szCs w:val="26"/>
-                    </w:rPr>
-                    <m:t xml:space="preserve"> kg</m:t>
+                    <m:t>{{ solido_combusible }} kg</m:t>
                   </m:r>
                 </m:num>
                 <m:den>
@@ -4020,18 +4026,7 @@
               <w:sz w:val="26"/>
               <w:szCs w:val="26"/>
             </w:rPr>
-            <m:t xml:space="preserve">= </m:t>
-          </m:r>
-          <m:r>
-            <m:rPr>
-              <m:sty m:val="bi"/>
-            </m:rPr>
-            <w:rPr>
-              <w:rFonts w:ascii="Cambria Math" w:hAnsi="Cambria Math"/>
-              <w:sz w:val="26"/>
-              <w:szCs w:val="26"/>
-            </w:rPr>
-            <m:t>{{ valor_gri }}</m:t>
+            <m:t>= {{ valor_gri }}</m:t>
           </m:r>
         </m:oMath>
       </m:oMathPara>
@@ -7196,7 +7191,23 @@
           <w:bCs/>
           <w:color w:val="000000"/>
         </w:rPr>
-        <w:t xml:space="preserve">El número de integrantes de la brigada contra incendio, se tendrá, considerando, al menos: </w:t>
+        <w:t xml:space="preserve">El número de integrantes de la brigada contra </w:t>
+      </w:r>
+      <w:r>
+        <w:rPr>
+          <w:rFonts w:eastAsia="Arial Unicode MS"/>
+          <w:bCs/>
+          <w:color w:val="000000"/>
+        </w:rPr>
+        <w:t>incendio</w:t>
+      </w:r>
+      <w:r>
+        <w:rPr>
+          <w:rFonts w:eastAsia="Arial Unicode MS"/>
+          <w:bCs/>
+          <w:color w:val="000000"/>
+        </w:rPr>
+        <w:t xml:space="preserve"> se tendrá, considerando, al menos: </w:t>
       </w:r>
     </w:p>
     <w:p>

</xml_diff>

<commit_message>
Actualizacion plantillas {{ anio }}
</commit_message>
<xml_diff>
--- a/Inputs/Templates/GRI BBVA.docx
+++ b/Inputs/Templates/GRI BBVA.docx
@@ -1,6 +1,6 @@
 
 <file path=word/document.xml><?xml version="1.0" encoding="utf-8"?>
-<w:document xmlns:wpc="http://schemas.microsoft.com/office/word/2010/wordprocessingCanvas" xmlns:cx="http://schemas.microsoft.com/office/drawing/2014/chartex" xmlns:cx1="http://schemas.microsoft.com/office/drawing/2015/9/8/chartex" xmlns:cx2="http://schemas.microsoft.com/office/drawing/2015/10/21/chartex" xmlns:cx3="http://schemas.microsoft.com/office/drawing/2016/5/9/chartex" xmlns:cx4="http://schemas.microsoft.com/office/drawing/2016/5/10/chartex" xmlns:cx5="http://schemas.microsoft.com/office/drawing/2016/5/11/chartex" xmlns:cx6="http://schemas.microsoft.com/office/drawing/2016/5/12/chartex" xmlns:cx7="http://schemas.microsoft.com/office/drawing/2016/5/13/chartex" xmlns:cx8="http://schemas.microsoft.com/office/drawing/2016/5/14/chartex" xmlns:mc="http://schemas.openxmlformats.org/markup-compatibility/2006" xmlns:aink="http://schemas.microsoft.com/office/drawing/2016/ink" xmlns:am3d="http://schemas.microsoft.com/office/drawing/2017/model3d" xmlns:o="urn:schemas-microsoft-com:office:office" xmlns:oel="http://schemas.microsoft.com/office/2019/extlst" xmlns:r="http://schemas.openxmlformats.org/officeDocument/2006/relationships" xmlns:m="http://schemas.openxmlformats.org/officeDocument/2006/math" xmlns:v="urn:schemas-microsoft-com:vml" xmlns:wp14="http://schemas.microsoft.com/office/word/2010/wordprocessingDrawing" xmlns:wp="http://schemas.openxmlformats.org/drawingml/2006/wordprocessingDrawing" xmlns:w10="urn:schemas-microsoft-com:office:word" xmlns:w="http://schemas.openxmlformats.org/wordprocessingml/2006/main" xmlns:w14="http://schemas.microsoft.com/office/word/2010/wordml" xmlns:w15="http://schemas.microsoft.com/office/word/2012/wordml" xmlns:w16cex="http://schemas.microsoft.com/office/word/2018/wordml/cex" xmlns:w16cid="http://schemas.microsoft.com/office/word/2016/wordml/cid" xmlns:w16="http://schemas.microsoft.com/office/word/2018/wordml" xmlns:w16du="http://schemas.microsoft.com/office/word/2023/wordml/word16du" xmlns:w16sdtdh="http://schemas.microsoft.com/office/word/2020/wordml/sdtdatahash" xmlns:w16se="http://schemas.microsoft.com/office/word/2015/wordml/symex" xmlns:wpg="http://schemas.microsoft.com/office/word/2010/wordprocessingGroup" xmlns:wpi="http://schemas.microsoft.com/office/word/2010/wordprocessingInk" xmlns:wne="http://schemas.microsoft.com/office/word/2006/wordml" xmlns:wps="http://schemas.microsoft.com/office/word/2010/wordprocessingShape" mc:Ignorable="w14 w15 w16se w16cid w16 w16cex w16sdtdh w16du wp14">
+<w:document xmlns:wpc="http://schemas.microsoft.com/office/word/2010/wordprocessingCanvas" xmlns:cx="http://schemas.microsoft.com/office/drawing/2014/chartex" xmlns:cx1="http://schemas.microsoft.com/office/drawing/2015/9/8/chartex" xmlns:cx2="http://schemas.microsoft.com/office/drawing/2015/10/21/chartex" xmlns:cx3="http://schemas.microsoft.com/office/drawing/2016/5/9/chartex" xmlns:cx4="http://schemas.microsoft.com/office/drawing/2016/5/10/chartex" xmlns:cx5="http://schemas.microsoft.com/office/drawing/2016/5/11/chartex" xmlns:cx6="http://schemas.microsoft.com/office/drawing/2016/5/12/chartex" xmlns:cx7="http://schemas.microsoft.com/office/drawing/2016/5/13/chartex" xmlns:cx8="http://schemas.microsoft.com/office/drawing/2016/5/14/chartex" xmlns:mc="http://schemas.openxmlformats.org/markup-compatibility/2006" xmlns:aink="http://schemas.microsoft.com/office/drawing/2016/ink" xmlns:am3d="http://schemas.microsoft.com/office/drawing/2017/model3d" xmlns:o="urn:schemas-microsoft-com:office:office" xmlns:oel="http://schemas.microsoft.com/office/2019/extlst" xmlns:r="http://schemas.openxmlformats.org/officeDocument/2006/relationships" xmlns:m="http://schemas.openxmlformats.org/officeDocument/2006/math" xmlns:v="urn:schemas-microsoft-com:vml" xmlns:wp14="http://schemas.microsoft.com/office/word/2010/wordprocessingDrawing" xmlns:wp="http://schemas.openxmlformats.org/drawingml/2006/wordprocessingDrawing" xmlns:w10="urn:schemas-microsoft-com:office:word" xmlns:w="http://schemas.openxmlformats.org/wordprocessingml/2006/main" xmlns:w14="http://schemas.microsoft.com/office/word/2010/wordml" xmlns:w15="http://schemas.microsoft.com/office/word/2012/wordml" xmlns:w16cex="http://schemas.microsoft.com/office/word/2018/wordml/cex" xmlns:w16cid="http://schemas.microsoft.com/office/word/2016/wordml/cid" xmlns:w16="http://schemas.microsoft.com/office/word/2018/wordml" xmlns:w16du="http://schemas.microsoft.com/office/word/2023/wordml/word16du" xmlns:w16sdtdh="http://schemas.microsoft.com/office/word/2020/wordml/sdtdatahash" xmlns:w16sdtfl="http://schemas.microsoft.com/office/word/2024/wordml/sdtformatlock" xmlns:w16se="http://schemas.microsoft.com/office/word/2015/wordml/symex" xmlns:wpg="http://schemas.microsoft.com/office/word/2010/wordprocessingGroup" xmlns:wpi="http://schemas.microsoft.com/office/word/2010/wordprocessingInk" xmlns:wne="http://schemas.microsoft.com/office/word/2006/wordml" xmlns:wps="http://schemas.microsoft.com/office/word/2010/wordprocessingShape" mc:Ignorable="w14 w15 w16se w16cid w16 w16cex w16sdtdh w16sdtfl w16du wp14">
   <w:body>
     <w:tbl>
       <w:tblPr>
@@ -264,36 +264,6 @@
                 <w:sz w:val="32"/>
               </w:rPr>
               <w:t>no_exterior</w:t>
-            </w:r>
-            <w:proofErr w:type="spellEnd"/>
-            <w:r>
-              <w:rPr>
-                <w:color w:val="767171" w:themeColor="background2" w:themeShade="80"/>
-                <w:sz w:val="32"/>
-              </w:rPr>
-              <w:t xml:space="preserve"> }}</w:t>
-            </w:r>
-            <w:r>
-              <w:rPr>
-                <w:color w:val="767171" w:themeColor="background2" w:themeShade="80"/>
-                <w:sz w:val="32"/>
-              </w:rPr>
-              <w:t xml:space="preserve"> </w:t>
-            </w:r>
-            <w:r>
-              <w:rPr>
-                <w:color w:val="767171" w:themeColor="background2" w:themeShade="80"/>
-                <w:sz w:val="32"/>
-              </w:rPr>
-              <w:t xml:space="preserve">{{ </w:t>
-            </w:r>
-            <w:proofErr w:type="spellStart"/>
-            <w:r>
-              <w:rPr>
-                <w:color w:val="767171" w:themeColor="background2" w:themeShade="80"/>
-                <w:sz w:val="32"/>
-              </w:rPr>
-              <w:t>no_interior</w:t>
             </w:r>
             <w:proofErr w:type="spellEnd"/>
             <w:r>
@@ -3803,7 +3773,51 @@
                       <w:sz w:val="26"/>
                       <w:szCs w:val="26"/>
                     </w:rPr>
-                    <m:t>{{ gas_inflamable }}</m:t>
+                    <m:t xml:space="preserve">{{ </m:t>
+                  </m:r>
+                  <m:r>
+                    <m:rPr>
+                      <m:sty m:val="bi"/>
+                    </m:rPr>
+                    <w:rPr>
+                      <w:rFonts w:ascii="Cambria Math" w:hAnsi="Cambria Math"/>
+                      <w:sz w:val="26"/>
+                      <w:szCs w:val="26"/>
+                    </w:rPr>
+                    <m:t>gas</m:t>
+                  </m:r>
+                  <m:r>
+                    <m:rPr>
+                      <m:sty m:val="bi"/>
+                    </m:rPr>
+                    <w:rPr>
+                      <w:rFonts w:ascii="Cambria Math" w:hAnsi="Cambria Math"/>
+                      <w:sz w:val="26"/>
+                      <w:szCs w:val="26"/>
+                    </w:rPr>
+                    <m:t>_</m:t>
+                  </m:r>
+                  <m:r>
+                    <m:rPr>
+                      <m:sty m:val="bi"/>
+                    </m:rPr>
+                    <w:rPr>
+                      <w:rFonts w:ascii="Cambria Math" w:hAnsi="Cambria Math"/>
+                      <w:sz w:val="26"/>
+                      <w:szCs w:val="26"/>
+                    </w:rPr>
+                    <m:t>inflamable</m:t>
+                  </m:r>
+                  <m:r>
+                    <m:rPr>
+                      <m:sty m:val="bi"/>
+                    </m:rPr>
+                    <w:rPr>
+                      <w:rFonts w:ascii="Cambria Math" w:hAnsi="Cambria Math"/>
+                      <w:sz w:val="26"/>
+                      <w:szCs w:val="26"/>
+                    </w:rPr>
+                    <m:t xml:space="preserve"> }}</m:t>
                   </m:r>
                 </m:num>
                 <m:den>
@@ -3816,7 +3830,29 @@
                       <w:sz w:val="26"/>
                       <w:szCs w:val="26"/>
                     </w:rPr>
-                    <m:t>3000 litros</m:t>
+                    <m:t>3000</m:t>
+                  </m:r>
+                  <m:r>
+                    <m:rPr>
+                      <m:sty m:val="bi"/>
+                    </m:rPr>
+                    <w:rPr>
+                      <w:rFonts w:ascii="Cambria Math" w:hAnsi="Cambria Math"/>
+                      <w:sz w:val="26"/>
+                      <w:szCs w:val="26"/>
+                    </w:rPr>
+                    <m:t xml:space="preserve"> </m:t>
+                  </m:r>
+                  <m:r>
+                    <m:rPr>
+                      <m:sty m:val="bi"/>
+                    </m:rPr>
+                    <w:rPr>
+                      <w:rFonts w:ascii="Cambria Math" w:hAnsi="Cambria Math"/>
+                      <w:sz w:val="26"/>
+                      <w:szCs w:val="26"/>
+                    </w:rPr>
+                    <m:t>litros</m:t>
                   </m:r>
                 </m:den>
               </m:f>
@@ -3868,7 +3904,51 @@
                       <w:sz w:val="26"/>
                       <w:szCs w:val="26"/>
                     </w:rPr>
-                    <m:t>{{ liquido_inflamable }}</m:t>
+                    <m:t xml:space="preserve">{{ </m:t>
+                  </m:r>
+                  <m:r>
+                    <m:rPr>
+                      <m:sty m:val="bi"/>
+                    </m:rPr>
+                    <w:rPr>
+                      <w:rFonts w:ascii="Cambria Math" w:hAnsi="Cambria Math"/>
+                      <w:sz w:val="26"/>
+                      <w:szCs w:val="26"/>
+                    </w:rPr>
+                    <m:t>liquido</m:t>
+                  </m:r>
+                  <m:r>
+                    <m:rPr>
+                      <m:sty m:val="bi"/>
+                    </m:rPr>
+                    <w:rPr>
+                      <w:rFonts w:ascii="Cambria Math" w:hAnsi="Cambria Math"/>
+                      <w:sz w:val="26"/>
+                      <w:szCs w:val="26"/>
+                    </w:rPr>
+                    <m:t>_</m:t>
+                  </m:r>
+                  <m:r>
+                    <m:rPr>
+                      <m:sty m:val="bi"/>
+                    </m:rPr>
+                    <w:rPr>
+                      <w:rFonts w:ascii="Cambria Math" w:hAnsi="Cambria Math"/>
+                      <w:sz w:val="26"/>
+                      <w:szCs w:val="26"/>
+                    </w:rPr>
+                    <m:t>inflamable</m:t>
+                  </m:r>
+                  <m:r>
+                    <m:rPr>
+                      <m:sty m:val="bi"/>
+                    </m:rPr>
+                    <w:rPr>
+                      <w:rFonts w:ascii="Cambria Math" w:hAnsi="Cambria Math"/>
+                      <w:sz w:val="26"/>
+                      <w:szCs w:val="26"/>
+                    </w:rPr>
+                    <m:t xml:space="preserve"> }}</m:t>
                   </m:r>
                 </m:num>
                 <m:den>
@@ -3881,7 +3961,29 @@
                       <w:sz w:val="26"/>
                       <w:szCs w:val="26"/>
                     </w:rPr>
-                    <m:t>1400 litros</m:t>
+                    <m:t>1400</m:t>
+                  </m:r>
+                  <m:r>
+                    <m:rPr>
+                      <m:sty m:val="bi"/>
+                    </m:rPr>
+                    <w:rPr>
+                      <w:rFonts w:ascii="Cambria Math" w:hAnsi="Cambria Math"/>
+                      <w:sz w:val="26"/>
+                      <w:szCs w:val="26"/>
+                    </w:rPr>
+                    <m:t xml:space="preserve"> </m:t>
+                  </m:r>
+                  <m:r>
+                    <m:rPr>
+                      <m:sty m:val="bi"/>
+                    </m:rPr>
+                    <w:rPr>
+                      <w:rFonts w:ascii="Cambria Math" w:hAnsi="Cambria Math"/>
+                      <w:sz w:val="26"/>
+                      <w:szCs w:val="26"/>
+                    </w:rPr>
+                    <m:t>litros</m:t>
                   </m:r>
                 </m:den>
               </m:f>
@@ -3933,7 +4035,51 @@
                       <w:sz w:val="26"/>
                       <w:szCs w:val="26"/>
                     </w:rPr>
-                    <m:t>{{ liquido_combustible }}</m:t>
+                    <m:t xml:space="preserve">{{ </m:t>
+                  </m:r>
+                  <m:r>
+                    <m:rPr>
+                      <m:sty m:val="bi"/>
+                    </m:rPr>
+                    <w:rPr>
+                      <w:rFonts w:ascii="Cambria Math" w:hAnsi="Cambria Math"/>
+                      <w:sz w:val="26"/>
+                      <w:szCs w:val="26"/>
+                    </w:rPr>
+                    <m:t>liquido</m:t>
+                  </m:r>
+                  <m:r>
+                    <m:rPr>
+                      <m:sty m:val="bi"/>
+                    </m:rPr>
+                    <w:rPr>
+                      <w:rFonts w:ascii="Cambria Math" w:hAnsi="Cambria Math"/>
+                      <w:sz w:val="26"/>
+                      <w:szCs w:val="26"/>
+                    </w:rPr>
+                    <m:t>_</m:t>
+                  </m:r>
+                  <m:r>
+                    <m:rPr>
+                      <m:sty m:val="bi"/>
+                    </m:rPr>
+                    <w:rPr>
+                      <w:rFonts w:ascii="Cambria Math" w:hAnsi="Cambria Math"/>
+                      <w:sz w:val="26"/>
+                      <w:szCs w:val="26"/>
+                    </w:rPr>
+                    <m:t>combustible</m:t>
+                  </m:r>
+                  <m:r>
+                    <m:rPr>
+                      <m:sty m:val="bi"/>
+                    </m:rPr>
+                    <w:rPr>
+                      <w:rFonts w:ascii="Cambria Math" w:hAnsi="Cambria Math"/>
+                      <w:sz w:val="26"/>
+                      <w:szCs w:val="26"/>
+                    </w:rPr>
+                    <m:t xml:space="preserve"> }}</m:t>
                   </m:r>
                 </m:num>
                 <m:den>
@@ -3946,7 +4092,29 @@
                       <w:sz w:val="26"/>
                       <w:szCs w:val="26"/>
                     </w:rPr>
-                    <m:t>2000 litros</m:t>
+                    <m:t>2000</m:t>
+                  </m:r>
+                  <m:r>
+                    <m:rPr>
+                      <m:sty m:val="bi"/>
+                    </m:rPr>
+                    <w:rPr>
+                      <w:rFonts w:ascii="Cambria Math" w:hAnsi="Cambria Math"/>
+                      <w:sz w:val="26"/>
+                      <w:szCs w:val="26"/>
+                    </w:rPr>
+                    <m:t xml:space="preserve"> </m:t>
+                  </m:r>
+                  <m:r>
+                    <m:rPr>
+                      <m:sty m:val="bi"/>
+                    </m:rPr>
+                    <w:rPr>
+                      <w:rFonts w:ascii="Cambria Math" w:hAnsi="Cambria Math"/>
+                      <w:sz w:val="26"/>
+                      <w:szCs w:val="26"/>
+                    </w:rPr>
+                    <m:t>litros</m:t>
                   </m:r>
                 </m:den>
               </m:f>
@@ -3998,7 +4166,62 @@
                       <w:sz w:val="26"/>
                       <w:szCs w:val="26"/>
                     </w:rPr>
-                    <m:t>{{ solido_combusible }} kg</m:t>
+                    <m:t xml:space="preserve">{{ </m:t>
+                  </m:r>
+                  <m:r>
+                    <m:rPr>
+                      <m:sty m:val="bi"/>
+                    </m:rPr>
+                    <w:rPr>
+                      <w:rFonts w:ascii="Cambria Math" w:hAnsi="Cambria Math"/>
+                      <w:sz w:val="26"/>
+                      <w:szCs w:val="26"/>
+                    </w:rPr>
+                    <m:t>solido</m:t>
+                  </m:r>
+                  <m:r>
+                    <m:rPr>
+                      <m:sty m:val="bi"/>
+                    </m:rPr>
+                    <w:rPr>
+                      <w:rFonts w:ascii="Cambria Math" w:hAnsi="Cambria Math"/>
+                      <w:sz w:val="26"/>
+                      <w:szCs w:val="26"/>
+                    </w:rPr>
+                    <m:t>_</m:t>
+                  </m:r>
+                  <m:r>
+                    <m:rPr>
+                      <m:sty m:val="bi"/>
+                    </m:rPr>
+                    <w:rPr>
+                      <w:rFonts w:ascii="Cambria Math" w:hAnsi="Cambria Math"/>
+                      <w:sz w:val="26"/>
+                      <w:szCs w:val="26"/>
+                    </w:rPr>
+                    <m:t>combusible</m:t>
+                  </m:r>
+                  <m:r>
+                    <m:rPr>
+                      <m:sty m:val="bi"/>
+                    </m:rPr>
+                    <w:rPr>
+                      <w:rFonts w:ascii="Cambria Math" w:hAnsi="Cambria Math"/>
+                      <w:sz w:val="26"/>
+                      <w:szCs w:val="26"/>
+                    </w:rPr>
+                    <m:t xml:space="preserve"> }} </m:t>
+                  </m:r>
+                  <m:r>
+                    <m:rPr>
+                      <m:sty m:val="bi"/>
+                    </m:rPr>
+                    <w:rPr>
+                      <w:rFonts w:ascii="Cambria Math" w:hAnsi="Cambria Math"/>
+                      <w:sz w:val="26"/>
+                      <w:szCs w:val="26"/>
+                    </w:rPr>
+                    <m:t>kg</m:t>
                   </m:r>
                 </m:num>
                 <m:den>
@@ -4011,7 +4234,29 @@
                       <w:sz w:val="26"/>
                       <w:szCs w:val="26"/>
                     </w:rPr>
-                    <m:t>15000 kg</m:t>
+                    <m:t>15000</m:t>
+                  </m:r>
+                  <m:r>
+                    <m:rPr>
+                      <m:sty m:val="bi"/>
+                    </m:rPr>
+                    <w:rPr>
+                      <w:rFonts w:ascii="Cambria Math" w:hAnsi="Cambria Math"/>
+                      <w:sz w:val="26"/>
+                      <w:szCs w:val="26"/>
+                    </w:rPr>
+                    <m:t xml:space="preserve"> </m:t>
+                  </m:r>
+                  <m:r>
+                    <m:rPr>
+                      <m:sty m:val="bi"/>
+                    </m:rPr>
+                    <w:rPr>
+                      <w:rFonts w:ascii="Cambria Math" w:hAnsi="Cambria Math"/>
+                      <w:sz w:val="26"/>
+                      <w:szCs w:val="26"/>
+                    </w:rPr>
+                    <m:t>kg</m:t>
                   </m:r>
                 </m:den>
               </m:f>
@@ -4026,7 +4271,51 @@
               <w:sz w:val="26"/>
               <w:szCs w:val="26"/>
             </w:rPr>
-            <m:t>= {{ valor_gri }}</m:t>
+            <m:t xml:space="preserve">= {{ </m:t>
+          </m:r>
+          <m:r>
+            <m:rPr>
+              <m:sty m:val="bi"/>
+            </m:rPr>
+            <w:rPr>
+              <w:rFonts w:ascii="Cambria Math" w:hAnsi="Cambria Math"/>
+              <w:sz w:val="26"/>
+              <w:szCs w:val="26"/>
+            </w:rPr>
+            <m:t>valor</m:t>
+          </m:r>
+          <m:r>
+            <m:rPr>
+              <m:sty m:val="bi"/>
+            </m:rPr>
+            <w:rPr>
+              <w:rFonts w:ascii="Cambria Math" w:hAnsi="Cambria Math"/>
+              <w:sz w:val="26"/>
+              <w:szCs w:val="26"/>
+            </w:rPr>
+            <m:t>_</m:t>
+          </m:r>
+          <m:r>
+            <m:rPr>
+              <m:sty m:val="bi"/>
+            </m:rPr>
+            <w:rPr>
+              <w:rFonts w:ascii="Cambria Math" w:hAnsi="Cambria Math"/>
+              <w:sz w:val="26"/>
+              <w:szCs w:val="26"/>
+            </w:rPr>
+            <m:t>gri</m:t>
+          </m:r>
+          <m:r>
+            <m:rPr>
+              <m:sty m:val="bi"/>
+            </m:rPr>
+            <w:rPr>
+              <w:rFonts w:ascii="Cambria Math" w:hAnsi="Cambria Math"/>
+              <w:sz w:val="26"/>
+              <w:szCs w:val="26"/>
+            </w:rPr>
+            <m:t xml:space="preserve"> }}</m:t>
           </m:r>
         </m:oMath>
       </m:oMathPara>
@@ -9910,7 +10199,7 @@
 </file>
 
 <file path=word/endnotes.xml><?xml version="1.0" encoding="utf-8"?>
-<w:endnotes xmlns:wpc="http://schemas.microsoft.com/office/word/2010/wordprocessingCanvas" xmlns:cx="http://schemas.microsoft.com/office/drawing/2014/chartex" xmlns:cx1="http://schemas.microsoft.com/office/drawing/2015/9/8/chartex" xmlns:cx2="http://schemas.microsoft.com/office/drawing/2015/10/21/chartex" xmlns:cx3="http://schemas.microsoft.com/office/drawing/2016/5/9/chartex" xmlns:cx4="http://schemas.microsoft.com/office/drawing/2016/5/10/chartex" xmlns:cx5="http://schemas.microsoft.com/office/drawing/2016/5/11/chartex" xmlns:cx6="http://schemas.microsoft.com/office/drawing/2016/5/12/chartex" xmlns:cx7="http://schemas.microsoft.com/office/drawing/2016/5/13/chartex" xmlns:cx8="http://schemas.microsoft.com/office/drawing/2016/5/14/chartex" xmlns:mc="http://schemas.openxmlformats.org/markup-compatibility/2006" xmlns:aink="http://schemas.microsoft.com/office/drawing/2016/ink" xmlns:am3d="http://schemas.microsoft.com/office/drawing/2017/model3d" xmlns:o="urn:schemas-microsoft-com:office:office" xmlns:oel="http://schemas.microsoft.com/office/2019/extlst" xmlns:r="http://schemas.openxmlformats.org/officeDocument/2006/relationships" xmlns:m="http://schemas.openxmlformats.org/officeDocument/2006/math" xmlns:v="urn:schemas-microsoft-com:vml" xmlns:wp14="http://schemas.microsoft.com/office/word/2010/wordprocessingDrawing" xmlns:wp="http://schemas.openxmlformats.org/drawingml/2006/wordprocessingDrawing" xmlns:w10="urn:schemas-microsoft-com:office:word" xmlns:w="http://schemas.openxmlformats.org/wordprocessingml/2006/main" xmlns:w14="http://schemas.microsoft.com/office/word/2010/wordml" xmlns:w15="http://schemas.microsoft.com/office/word/2012/wordml" xmlns:w16cex="http://schemas.microsoft.com/office/word/2018/wordml/cex" xmlns:w16cid="http://schemas.microsoft.com/office/word/2016/wordml/cid" xmlns:w16="http://schemas.microsoft.com/office/word/2018/wordml" xmlns:w16du="http://schemas.microsoft.com/office/word/2023/wordml/word16du" xmlns:w16sdtdh="http://schemas.microsoft.com/office/word/2020/wordml/sdtdatahash" xmlns:w16se="http://schemas.microsoft.com/office/word/2015/wordml/symex" xmlns:wpg="http://schemas.microsoft.com/office/word/2010/wordprocessingGroup" xmlns:wpi="http://schemas.microsoft.com/office/word/2010/wordprocessingInk" xmlns:wne="http://schemas.microsoft.com/office/word/2006/wordml" xmlns:wps="http://schemas.microsoft.com/office/word/2010/wordprocessingShape" mc:Ignorable="w14 w15 w16se w16cid w16 w16cex w16sdtdh w16du wp14">
+<w:endnotes xmlns:wpc="http://schemas.microsoft.com/office/word/2010/wordprocessingCanvas" xmlns:cx="http://schemas.microsoft.com/office/drawing/2014/chartex" xmlns:cx1="http://schemas.microsoft.com/office/drawing/2015/9/8/chartex" xmlns:cx2="http://schemas.microsoft.com/office/drawing/2015/10/21/chartex" xmlns:cx3="http://schemas.microsoft.com/office/drawing/2016/5/9/chartex" xmlns:cx4="http://schemas.microsoft.com/office/drawing/2016/5/10/chartex" xmlns:cx5="http://schemas.microsoft.com/office/drawing/2016/5/11/chartex" xmlns:cx6="http://schemas.microsoft.com/office/drawing/2016/5/12/chartex" xmlns:cx7="http://schemas.microsoft.com/office/drawing/2016/5/13/chartex" xmlns:cx8="http://schemas.microsoft.com/office/drawing/2016/5/14/chartex" xmlns:mc="http://schemas.openxmlformats.org/markup-compatibility/2006" xmlns:aink="http://schemas.microsoft.com/office/drawing/2016/ink" xmlns:am3d="http://schemas.microsoft.com/office/drawing/2017/model3d" xmlns:o="urn:schemas-microsoft-com:office:office" xmlns:oel="http://schemas.microsoft.com/office/2019/extlst" xmlns:r="http://schemas.openxmlformats.org/officeDocument/2006/relationships" xmlns:m="http://schemas.openxmlformats.org/officeDocument/2006/math" xmlns:v="urn:schemas-microsoft-com:vml" xmlns:wp14="http://schemas.microsoft.com/office/word/2010/wordprocessingDrawing" xmlns:wp="http://schemas.openxmlformats.org/drawingml/2006/wordprocessingDrawing" xmlns:w10="urn:schemas-microsoft-com:office:word" xmlns:w="http://schemas.openxmlformats.org/wordprocessingml/2006/main" xmlns:w14="http://schemas.microsoft.com/office/word/2010/wordml" xmlns:w15="http://schemas.microsoft.com/office/word/2012/wordml" xmlns:w16cex="http://schemas.microsoft.com/office/word/2018/wordml/cex" xmlns:w16cid="http://schemas.microsoft.com/office/word/2016/wordml/cid" xmlns:w16="http://schemas.microsoft.com/office/word/2018/wordml" xmlns:w16du="http://schemas.microsoft.com/office/word/2023/wordml/word16du" xmlns:w16sdtdh="http://schemas.microsoft.com/office/word/2020/wordml/sdtdatahash" xmlns:w16sdtfl="http://schemas.microsoft.com/office/word/2024/wordml/sdtformatlock" xmlns:w16se="http://schemas.microsoft.com/office/word/2015/wordml/symex" xmlns:wpg="http://schemas.microsoft.com/office/word/2010/wordprocessingGroup" xmlns:wpi="http://schemas.microsoft.com/office/word/2010/wordprocessingInk" xmlns:wne="http://schemas.microsoft.com/office/word/2006/wordml" xmlns:wps="http://schemas.microsoft.com/office/word/2010/wordprocessingShape" mc:Ignorable="w14 w15 w16se w16cid w16 w16cex w16sdtdh w16sdtfl w16du wp14">
   <w:endnote w:type="separator" w:id="-1">
     <w:p>
       <w:pPr>
@@ -9942,7 +10231,7 @@
 </file>
 
 <file path=word/footer1.xml><?xml version="1.0" encoding="utf-8"?>
-<w:ftr xmlns:wpc="http://schemas.microsoft.com/office/word/2010/wordprocessingCanvas" xmlns:cx="http://schemas.microsoft.com/office/drawing/2014/chartex" xmlns:cx1="http://schemas.microsoft.com/office/drawing/2015/9/8/chartex" xmlns:cx2="http://schemas.microsoft.com/office/drawing/2015/10/21/chartex" xmlns:cx3="http://schemas.microsoft.com/office/drawing/2016/5/9/chartex" xmlns:cx4="http://schemas.microsoft.com/office/drawing/2016/5/10/chartex" xmlns:cx5="http://schemas.microsoft.com/office/drawing/2016/5/11/chartex" xmlns:cx6="http://schemas.microsoft.com/office/drawing/2016/5/12/chartex" xmlns:cx7="http://schemas.microsoft.com/office/drawing/2016/5/13/chartex" xmlns:cx8="http://schemas.microsoft.com/office/drawing/2016/5/14/chartex" xmlns:mc="http://schemas.openxmlformats.org/markup-compatibility/2006" xmlns:aink="http://schemas.microsoft.com/office/drawing/2016/ink" xmlns:am3d="http://schemas.microsoft.com/office/drawing/2017/model3d" xmlns:o="urn:schemas-microsoft-com:office:office" xmlns:oel="http://schemas.microsoft.com/office/2019/extlst" xmlns:r="http://schemas.openxmlformats.org/officeDocument/2006/relationships" xmlns:m="http://schemas.openxmlformats.org/officeDocument/2006/math" xmlns:v="urn:schemas-microsoft-com:vml" xmlns:wp14="http://schemas.microsoft.com/office/word/2010/wordprocessingDrawing" xmlns:wp="http://schemas.openxmlformats.org/drawingml/2006/wordprocessingDrawing" xmlns:w10="urn:schemas-microsoft-com:office:word" xmlns:w="http://schemas.openxmlformats.org/wordprocessingml/2006/main" xmlns:w14="http://schemas.microsoft.com/office/word/2010/wordml" xmlns:w15="http://schemas.microsoft.com/office/word/2012/wordml" xmlns:w16cex="http://schemas.microsoft.com/office/word/2018/wordml/cex" xmlns:w16cid="http://schemas.microsoft.com/office/word/2016/wordml/cid" xmlns:w16="http://schemas.microsoft.com/office/word/2018/wordml" xmlns:w16du="http://schemas.microsoft.com/office/word/2023/wordml/word16du" xmlns:w16sdtdh="http://schemas.microsoft.com/office/word/2020/wordml/sdtdatahash" xmlns:w16se="http://schemas.microsoft.com/office/word/2015/wordml/symex" xmlns:wpg="http://schemas.microsoft.com/office/word/2010/wordprocessingGroup" xmlns:wpi="http://schemas.microsoft.com/office/word/2010/wordprocessingInk" xmlns:wne="http://schemas.microsoft.com/office/word/2006/wordml" xmlns:wps="http://schemas.microsoft.com/office/word/2010/wordprocessingShape" mc:Ignorable="w14 w15 w16se w16cid w16 w16cex w16sdtdh w16du wp14">
+<w:ftr xmlns:wpc="http://schemas.microsoft.com/office/word/2010/wordprocessingCanvas" xmlns:cx="http://schemas.microsoft.com/office/drawing/2014/chartex" xmlns:cx1="http://schemas.microsoft.com/office/drawing/2015/9/8/chartex" xmlns:cx2="http://schemas.microsoft.com/office/drawing/2015/10/21/chartex" xmlns:cx3="http://schemas.microsoft.com/office/drawing/2016/5/9/chartex" xmlns:cx4="http://schemas.microsoft.com/office/drawing/2016/5/10/chartex" xmlns:cx5="http://schemas.microsoft.com/office/drawing/2016/5/11/chartex" xmlns:cx6="http://schemas.microsoft.com/office/drawing/2016/5/12/chartex" xmlns:cx7="http://schemas.microsoft.com/office/drawing/2016/5/13/chartex" xmlns:cx8="http://schemas.microsoft.com/office/drawing/2016/5/14/chartex" xmlns:mc="http://schemas.openxmlformats.org/markup-compatibility/2006" xmlns:aink="http://schemas.microsoft.com/office/drawing/2016/ink" xmlns:am3d="http://schemas.microsoft.com/office/drawing/2017/model3d" xmlns:o="urn:schemas-microsoft-com:office:office" xmlns:oel="http://schemas.microsoft.com/office/2019/extlst" xmlns:r="http://schemas.openxmlformats.org/officeDocument/2006/relationships" xmlns:m="http://schemas.openxmlformats.org/officeDocument/2006/math" xmlns:v="urn:schemas-microsoft-com:vml" xmlns:wp14="http://schemas.microsoft.com/office/word/2010/wordprocessingDrawing" xmlns:wp="http://schemas.openxmlformats.org/drawingml/2006/wordprocessingDrawing" xmlns:w10="urn:schemas-microsoft-com:office:word" xmlns:w="http://schemas.openxmlformats.org/wordprocessingml/2006/main" xmlns:w14="http://schemas.microsoft.com/office/word/2010/wordml" xmlns:w15="http://schemas.microsoft.com/office/word/2012/wordml" xmlns:w16cex="http://schemas.microsoft.com/office/word/2018/wordml/cex" xmlns:w16cid="http://schemas.microsoft.com/office/word/2016/wordml/cid" xmlns:w16="http://schemas.microsoft.com/office/word/2018/wordml" xmlns:w16du="http://schemas.microsoft.com/office/word/2023/wordml/word16du" xmlns:w16sdtdh="http://schemas.microsoft.com/office/word/2020/wordml/sdtdatahash" xmlns:w16sdtfl="http://schemas.microsoft.com/office/word/2024/wordml/sdtformatlock" xmlns:w16se="http://schemas.microsoft.com/office/word/2015/wordml/symex" xmlns:wpg="http://schemas.microsoft.com/office/word/2010/wordprocessingGroup" xmlns:wpi="http://schemas.microsoft.com/office/word/2010/wordprocessingInk" xmlns:wne="http://schemas.microsoft.com/office/word/2006/wordml" xmlns:wps="http://schemas.microsoft.com/office/word/2010/wordprocessingShape" mc:Ignorable="w14 w15 w16se w16cid w16 w16cex w16sdtdh w16sdtfl w16du wp14">
   <w:sdt>
     <w:sdtPr>
       <w:id w:val="-470131145"/>
@@ -10012,7 +10301,7 @@
 </file>
 
 <file path=word/footnotes.xml><?xml version="1.0" encoding="utf-8"?>
-<w:footnotes xmlns:wpc="http://schemas.microsoft.com/office/word/2010/wordprocessingCanvas" xmlns:cx="http://schemas.microsoft.com/office/drawing/2014/chartex" xmlns:cx1="http://schemas.microsoft.com/office/drawing/2015/9/8/chartex" xmlns:cx2="http://schemas.microsoft.com/office/drawing/2015/10/21/chartex" xmlns:cx3="http://schemas.microsoft.com/office/drawing/2016/5/9/chartex" xmlns:cx4="http://schemas.microsoft.com/office/drawing/2016/5/10/chartex" xmlns:cx5="http://schemas.microsoft.com/office/drawing/2016/5/11/chartex" xmlns:cx6="http://schemas.microsoft.com/office/drawing/2016/5/12/chartex" xmlns:cx7="http://schemas.microsoft.com/office/drawing/2016/5/13/chartex" xmlns:cx8="http://schemas.microsoft.com/office/drawing/2016/5/14/chartex" xmlns:mc="http://schemas.openxmlformats.org/markup-compatibility/2006" xmlns:aink="http://schemas.microsoft.com/office/drawing/2016/ink" xmlns:am3d="http://schemas.microsoft.com/office/drawing/2017/model3d" xmlns:o="urn:schemas-microsoft-com:office:office" xmlns:oel="http://schemas.microsoft.com/office/2019/extlst" xmlns:r="http://schemas.openxmlformats.org/officeDocument/2006/relationships" xmlns:m="http://schemas.openxmlformats.org/officeDocument/2006/math" xmlns:v="urn:schemas-microsoft-com:vml" xmlns:wp14="http://schemas.microsoft.com/office/word/2010/wordprocessingDrawing" xmlns:wp="http://schemas.openxmlformats.org/drawingml/2006/wordprocessingDrawing" xmlns:w10="urn:schemas-microsoft-com:office:word" xmlns:w="http://schemas.openxmlformats.org/wordprocessingml/2006/main" xmlns:w14="http://schemas.microsoft.com/office/word/2010/wordml" xmlns:w15="http://schemas.microsoft.com/office/word/2012/wordml" xmlns:w16cex="http://schemas.microsoft.com/office/word/2018/wordml/cex" xmlns:w16cid="http://schemas.microsoft.com/office/word/2016/wordml/cid" xmlns:w16="http://schemas.microsoft.com/office/word/2018/wordml" xmlns:w16du="http://schemas.microsoft.com/office/word/2023/wordml/word16du" xmlns:w16sdtdh="http://schemas.microsoft.com/office/word/2020/wordml/sdtdatahash" xmlns:w16se="http://schemas.microsoft.com/office/word/2015/wordml/symex" xmlns:wpg="http://schemas.microsoft.com/office/word/2010/wordprocessingGroup" xmlns:wpi="http://schemas.microsoft.com/office/word/2010/wordprocessingInk" xmlns:wne="http://schemas.microsoft.com/office/word/2006/wordml" xmlns:wps="http://schemas.microsoft.com/office/word/2010/wordprocessingShape" mc:Ignorable="w14 w15 w16se w16cid w16 w16cex w16sdtdh w16du wp14">
+<w:footnotes xmlns:wpc="http://schemas.microsoft.com/office/word/2010/wordprocessingCanvas" xmlns:cx="http://schemas.microsoft.com/office/drawing/2014/chartex" xmlns:cx1="http://schemas.microsoft.com/office/drawing/2015/9/8/chartex" xmlns:cx2="http://schemas.microsoft.com/office/drawing/2015/10/21/chartex" xmlns:cx3="http://schemas.microsoft.com/office/drawing/2016/5/9/chartex" xmlns:cx4="http://schemas.microsoft.com/office/drawing/2016/5/10/chartex" xmlns:cx5="http://schemas.microsoft.com/office/drawing/2016/5/11/chartex" xmlns:cx6="http://schemas.microsoft.com/office/drawing/2016/5/12/chartex" xmlns:cx7="http://schemas.microsoft.com/office/drawing/2016/5/13/chartex" xmlns:cx8="http://schemas.microsoft.com/office/drawing/2016/5/14/chartex" xmlns:mc="http://schemas.openxmlformats.org/markup-compatibility/2006" xmlns:aink="http://schemas.microsoft.com/office/drawing/2016/ink" xmlns:am3d="http://schemas.microsoft.com/office/drawing/2017/model3d" xmlns:o="urn:schemas-microsoft-com:office:office" xmlns:oel="http://schemas.microsoft.com/office/2019/extlst" xmlns:r="http://schemas.openxmlformats.org/officeDocument/2006/relationships" xmlns:m="http://schemas.openxmlformats.org/officeDocument/2006/math" xmlns:v="urn:schemas-microsoft-com:vml" xmlns:wp14="http://schemas.microsoft.com/office/word/2010/wordprocessingDrawing" xmlns:wp="http://schemas.openxmlformats.org/drawingml/2006/wordprocessingDrawing" xmlns:w10="urn:schemas-microsoft-com:office:word" xmlns:w="http://schemas.openxmlformats.org/wordprocessingml/2006/main" xmlns:w14="http://schemas.microsoft.com/office/word/2010/wordml" xmlns:w15="http://schemas.microsoft.com/office/word/2012/wordml" xmlns:w16cex="http://schemas.microsoft.com/office/word/2018/wordml/cex" xmlns:w16cid="http://schemas.microsoft.com/office/word/2016/wordml/cid" xmlns:w16="http://schemas.microsoft.com/office/word/2018/wordml" xmlns:w16du="http://schemas.microsoft.com/office/word/2023/wordml/word16du" xmlns:w16sdtdh="http://schemas.microsoft.com/office/word/2020/wordml/sdtdatahash" xmlns:w16sdtfl="http://schemas.microsoft.com/office/word/2024/wordml/sdtformatlock" xmlns:w16se="http://schemas.microsoft.com/office/word/2015/wordml/symex" xmlns:wpg="http://schemas.microsoft.com/office/word/2010/wordprocessingGroup" xmlns:wpi="http://schemas.microsoft.com/office/word/2010/wordprocessingInk" xmlns:wne="http://schemas.microsoft.com/office/word/2006/wordml" xmlns:wps="http://schemas.microsoft.com/office/word/2010/wordprocessingShape" mc:Ignorable="w14 w15 w16se w16cid w16 w16cex w16sdtdh w16sdtfl w16du wp14">
   <w:footnote w:type="separator" w:id="-1">
     <w:p>
       <w:pPr>
@@ -10044,7 +10333,7 @@
 </file>
 
 <file path=word/header1.xml><?xml version="1.0" encoding="utf-8"?>
-<w:hdr xmlns:wpc="http://schemas.microsoft.com/office/word/2010/wordprocessingCanvas" xmlns:cx="http://schemas.microsoft.com/office/drawing/2014/chartex" xmlns:cx1="http://schemas.microsoft.com/office/drawing/2015/9/8/chartex" xmlns:cx2="http://schemas.microsoft.com/office/drawing/2015/10/21/chartex" xmlns:cx3="http://schemas.microsoft.com/office/drawing/2016/5/9/chartex" xmlns:cx4="http://schemas.microsoft.com/office/drawing/2016/5/10/chartex" xmlns:cx5="http://schemas.microsoft.com/office/drawing/2016/5/11/chartex" xmlns:cx6="http://schemas.microsoft.com/office/drawing/2016/5/12/chartex" xmlns:cx7="http://schemas.microsoft.com/office/drawing/2016/5/13/chartex" xmlns:cx8="http://schemas.microsoft.com/office/drawing/2016/5/14/chartex" xmlns:mc="http://schemas.openxmlformats.org/markup-compatibility/2006" xmlns:aink="http://schemas.microsoft.com/office/drawing/2016/ink" xmlns:am3d="http://schemas.microsoft.com/office/drawing/2017/model3d" xmlns:o="urn:schemas-microsoft-com:office:office" xmlns:oel="http://schemas.microsoft.com/office/2019/extlst" xmlns:r="http://schemas.openxmlformats.org/officeDocument/2006/relationships" xmlns:m="http://schemas.openxmlformats.org/officeDocument/2006/math" xmlns:v="urn:schemas-microsoft-com:vml" xmlns:wp14="http://schemas.microsoft.com/office/word/2010/wordprocessingDrawing" xmlns:wp="http://schemas.openxmlformats.org/drawingml/2006/wordprocessingDrawing" xmlns:w10="urn:schemas-microsoft-com:office:word" xmlns:w="http://schemas.openxmlformats.org/wordprocessingml/2006/main" xmlns:w14="http://schemas.microsoft.com/office/word/2010/wordml" xmlns:w15="http://schemas.microsoft.com/office/word/2012/wordml" xmlns:w16cex="http://schemas.microsoft.com/office/word/2018/wordml/cex" xmlns:w16cid="http://schemas.microsoft.com/office/word/2016/wordml/cid" xmlns:w16="http://schemas.microsoft.com/office/word/2018/wordml" xmlns:w16du="http://schemas.microsoft.com/office/word/2023/wordml/word16du" xmlns:w16sdtdh="http://schemas.microsoft.com/office/word/2020/wordml/sdtdatahash" xmlns:w16se="http://schemas.microsoft.com/office/word/2015/wordml/symex" xmlns:wpg="http://schemas.microsoft.com/office/word/2010/wordprocessingGroup" xmlns:wpi="http://schemas.microsoft.com/office/word/2010/wordprocessingInk" xmlns:wne="http://schemas.microsoft.com/office/word/2006/wordml" xmlns:wps="http://schemas.microsoft.com/office/word/2010/wordprocessingShape" mc:Ignorable="w14 w15 w16se w16cid w16 w16cex w16sdtdh w16du wp14">
+<w:hdr xmlns:wpc="http://schemas.microsoft.com/office/word/2010/wordprocessingCanvas" xmlns:cx="http://schemas.microsoft.com/office/drawing/2014/chartex" xmlns:cx1="http://schemas.microsoft.com/office/drawing/2015/9/8/chartex" xmlns:cx2="http://schemas.microsoft.com/office/drawing/2015/10/21/chartex" xmlns:cx3="http://schemas.microsoft.com/office/drawing/2016/5/9/chartex" xmlns:cx4="http://schemas.microsoft.com/office/drawing/2016/5/10/chartex" xmlns:cx5="http://schemas.microsoft.com/office/drawing/2016/5/11/chartex" xmlns:cx6="http://schemas.microsoft.com/office/drawing/2016/5/12/chartex" xmlns:cx7="http://schemas.microsoft.com/office/drawing/2016/5/13/chartex" xmlns:cx8="http://schemas.microsoft.com/office/drawing/2016/5/14/chartex" xmlns:mc="http://schemas.openxmlformats.org/markup-compatibility/2006" xmlns:aink="http://schemas.microsoft.com/office/drawing/2016/ink" xmlns:am3d="http://schemas.microsoft.com/office/drawing/2017/model3d" xmlns:o="urn:schemas-microsoft-com:office:office" xmlns:oel="http://schemas.microsoft.com/office/2019/extlst" xmlns:r="http://schemas.openxmlformats.org/officeDocument/2006/relationships" xmlns:m="http://schemas.openxmlformats.org/officeDocument/2006/math" xmlns:v="urn:schemas-microsoft-com:vml" xmlns:wp14="http://schemas.microsoft.com/office/word/2010/wordprocessingDrawing" xmlns:wp="http://schemas.openxmlformats.org/drawingml/2006/wordprocessingDrawing" xmlns:w10="urn:schemas-microsoft-com:office:word" xmlns:w="http://schemas.openxmlformats.org/wordprocessingml/2006/main" xmlns:w14="http://schemas.microsoft.com/office/word/2010/wordml" xmlns:w15="http://schemas.microsoft.com/office/word/2012/wordml" xmlns:w16cex="http://schemas.microsoft.com/office/word/2018/wordml/cex" xmlns:w16cid="http://schemas.microsoft.com/office/word/2016/wordml/cid" xmlns:w16="http://schemas.microsoft.com/office/word/2018/wordml" xmlns:w16du="http://schemas.microsoft.com/office/word/2023/wordml/word16du" xmlns:w16sdtdh="http://schemas.microsoft.com/office/word/2020/wordml/sdtdatahash" xmlns:w16sdtfl="http://schemas.microsoft.com/office/word/2024/wordml/sdtformatlock" xmlns:w16se="http://schemas.microsoft.com/office/word/2015/wordml/symex" xmlns:wpg="http://schemas.microsoft.com/office/word/2010/wordprocessingGroup" xmlns:wpi="http://schemas.microsoft.com/office/word/2010/wordprocessingInk" xmlns:wne="http://schemas.microsoft.com/office/word/2006/wordml" xmlns:wps="http://schemas.microsoft.com/office/word/2010/wordprocessingShape" mc:Ignorable="w14 w15 w16se w16cid w16 w16cex w16sdtdh w16sdtfl w16du wp14">
   <w:tbl>
     <w:tblPr>
       <w:tblStyle w:val="Tablaconcuadrcula"/>
@@ -10182,23 +10471,13 @@
             </w:rPr>
             <w:t xml:space="preserve">{{ </w:t>
           </w:r>
-          <w:proofErr w:type="spellStart"/>
           <w:r>
             <w:rPr>
               <w:b/>
               <w:sz w:val="18"/>
               <w:szCs w:val="18"/>
             </w:rPr>
-            <w:t>nombre_comercial</w:t>
-          </w:r>
-          <w:proofErr w:type="spellEnd"/>
-          <w:r>
-            <w:rPr>
-              <w:b/>
-              <w:sz w:val="18"/>
-              <w:szCs w:val="18"/>
-            </w:rPr>
-            <w:t xml:space="preserve"> }}</w:t>
+            <w:t>nombre_comercial }}</w:t>
           </w:r>
         </w:p>
         <w:p>
@@ -10218,43 +10497,7 @@
               <w:sz w:val="18"/>
               <w:szCs w:val="18"/>
             </w:rPr>
-            <w:t xml:space="preserve">{{ </w:t>
-          </w:r>
-          <w:proofErr w:type="spellStart"/>
-          <w:r>
-            <w:rPr>
-              <w:b/>
-              <w:sz w:val="18"/>
-              <w:szCs w:val="18"/>
-            </w:rPr>
-            <w:t>dia</w:t>
-          </w:r>
-          <w:proofErr w:type="spellEnd"/>
-          <w:r>
-            <w:rPr>
-              <w:b/>
-              <w:sz w:val="18"/>
-              <w:szCs w:val="18"/>
-            </w:rPr>
-            <w:t xml:space="preserve"> }} DE {{ mes }} DE {{ </w:t>
-          </w:r>
-          <w:proofErr w:type="spellStart"/>
-          <w:r>
-            <w:rPr>
-              <w:b/>
-              <w:sz w:val="18"/>
-              <w:szCs w:val="18"/>
-            </w:rPr>
-            <w:t>anio</w:t>
-          </w:r>
-          <w:proofErr w:type="spellEnd"/>
-          <w:r>
-            <w:rPr>
-              <w:b/>
-              <w:sz w:val="18"/>
-              <w:szCs w:val="18"/>
-            </w:rPr>
-            <w:t xml:space="preserve"> }}</w:t>
+            <w:t>{{ dia }} DE {{ mes }} DE {{ anio }}</w:t>
           </w:r>
           <w:bookmarkEnd w:id="9"/>
         </w:p>
@@ -10279,25 +10522,7 @@
               <w:sz w:val="18"/>
               <w:szCs w:val="18"/>
             </w:rPr>
-            <w:t xml:space="preserve">{{ </w:t>
-          </w:r>
-          <w:proofErr w:type="spellStart"/>
-          <w:r>
-            <w:rPr>
-              <w:b/>
-              <w:sz w:val="18"/>
-              <w:szCs w:val="18"/>
-            </w:rPr>
-            <w:t>registro_perito</w:t>
-          </w:r>
-          <w:proofErr w:type="spellEnd"/>
-          <w:r>
-            <w:rPr>
-              <w:b/>
-              <w:sz w:val="18"/>
-              <w:szCs w:val="18"/>
-            </w:rPr>
-            <w:t xml:space="preserve"> }}</w:t>
+            <w:t>{{ registro_perito }}</w:t>
           </w:r>
         </w:p>
         <w:p>
@@ -10316,25 +10541,7 @@
               <w:sz w:val="18"/>
               <w:szCs w:val="18"/>
             </w:rPr>
-            <w:t xml:space="preserve">{{ </w:t>
-          </w:r>
-          <w:proofErr w:type="spellStart"/>
-          <w:r>
-            <w:rPr>
-              <w:b/>
-              <w:sz w:val="18"/>
-              <w:szCs w:val="18"/>
-            </w:rPr>
-            <w:t>no_registro</w:t>
-          </w:r>
-          <w:proofErr w:type="spellEnd"/>
-          <w:r>
-            <w:rPr>
-              <w:b/>
-              <w:sz w:val="18"/>
-              <w:szCs w:val="18"/>
-            </w:rPr>
-            <w:t xml:space="preserve"> }}</w:t>
+            <w:t>{{ no_registro }}</w:t>
           </w:r>
         </w:p>
       </w:tc>
@@ -10349,7 +10556,7 @@
 </file>
 
 <file path=word/numbering.xml><?xml version="1.0" encoding="utf-8"?>
-<w:numbering xmlns:wpc="http://schemas.microsoft.com/office/word/2010/wordprocessingCanvas" xmlns:cx="http://schemas.microsoft.com/office/drawing/2014/chartex" xmlns:cx1="http://schemas.microsoft.com/office/drawing/2015/9/8/chartex" xmlns:cx2="http://schemas.microsoft.com/office/drawing/2015/10/21/chartex" xmlns:cx3="http://schemas.microsoft.com/office/drawing/2016/5/9/chartex" xmlns:cx4="http://schemas.microsoft.com/office/drawing/2016/5/10/chartex" xmlns:cx5="http://schemas.microsoft.com/office/drawing/2016/5/11/chartex" xmlns:cx6="http://schemas.microsoft.com/office/drawing/2016/5/12/chartex" xmlns:cx7="http://schemas.microsoft.com/office/drawing/2016/5/13/chartex" xmlns:cx8="http://schemas.microsoft.com/office/drawing/2016/5/14/chartex" xmlns:mc="http://schemas.openxmlformats.org/markup-compatibility/2006" xmlns:aink="http://schemas.microsoft.com/office/drawing/2016/ink" xmlns:am3d="http://schemas.microsoft.com/office/drawing/2017/model3d" xmlns:o="urn:schemas-microsoft-com:office:office" xmlns:oel="http://schemas.microsoft.com/office/2019/extlst" xmlns:r="http://schemas.openxmlformats.org/officeDocument/2006/relationships" xmlns:m="http://schemas.openxmlformats.org/officeDocument/2006/math" xmlns:v="urn:schemas-microsoft-com:vml" xmlns:wp14="http://schemas.microsoft.com/office/word/2010/wordprocessingDrawing" xmlns:wp="http://schemas.openxmlformats.org/drawingml/2006/wordprocessingDrawing" xmlns:w10="urn:schemas-microsoft-com:office:word" xmlns:w="http://schemas.openxmlformats.org/wordprocessingml/2006/main" xmlns:w14="http://schemas.microsoft.com/office/word/2010/wordml" xmlns:w15="http://schemas.microsoft.com/office/word/2012/wordml" xmlns:w16cex="http://schemas.microsoft.com/office/word/2018/wordml/cex" xmlns:w16cid="http://schemas.microsoft.com/office/word/2016/wordml/cid" xmlns:w16="http://schemas.microsoft.com/office/word/2018/wordml" xmlns:w16du="http://schemas.microsoft.com/office/word/2023/wordml/word16du" xmlns:w16sdtdh="http://schemas.microsoft.com/office/word/2020/wordml/sdtdatahash" xmlns:w16se="http://schemas.microsoft.com/office/word/2015/wordml/symex" xmlns:wpg="http://schemas.microsoft.com/office/word/2010/wordprocessingGroup" xmlns:wpi="http://schemas.microsoft.com/office/word/2010/wordprocessingInk" xmlns:wne="http://schemas.microsoft.com/office/word/2006/wordml" xmlns:wps="http://schemas.microsoft.com/office/word/2010/wordprocessingShape" mc:Ignorable="w14 w15 w16se w16cid w16 w16cex w16sdtdh w16du wp14">
+<w:numbering xmlns:wpc="http://schemas.microsoft.com/office/word/2010/wordprocessingCanvas" xmlns:cx="http://schemas.microsoft.com/office/drawing/2014/chartex" xmlns:cx1="http://schemas.microsoft.com/office/drawing/2015/9/8/chartex" xmlns:cx2="http://schemas.microsoft.com/office/drawing/2015/10/21/chartex" xmlns:cx3="http://schemas.microsoft.com/office/drawing/2016/5/9/chartex" xmlns:cx4="http://schemas.microsoft.com/office/drawing/2016/5/10/chartex" xmlns:cx5="http://schemas.microsoft.com/office/drawing/2016/5/11/chartex" xmlns:cx6="http://schemas.microsoft.com/office/drawing/2016/5/12/chartex" xmlns:cx7="http://schemas.microsoft.com/office/drawing/2016/5/13/chartex" xmlns:cx8="http://schemas.microsoft.com/office/drawing/2016/5/14/chartex" xmlns:mc="http://schemas.openxmlformats.org/markup-compatibility/2006" xmlns:aink="http://schemas.microsoft.com/office/drawing/2016/ink" xmlns:am3d="http://schemas.microsoft.com/office/drawing/2017/model3d" xmlns:o="urn:schemas-microsoft-com:office:office" xmlns:oel="http://schemas.microsoft.com/office/2019/extlst" xmlns:r="http://schemas.openxmlformats.org/officeDocument/2006/relationships" xmlns:m="http://schemas.openxmlformats.org/officeDocument/2006/math" xmlns:v="urn:schemas-microsoft-com:vml" xmlns:wp14="http://schemas.microsoft.com/office/word/2010/wordprocessingDrawing" xmlns:wp="http://schemas.openxmlformats.org/drawingml/2006/wordprocessingDrawing" xmlns:w10="urn:schemas-microsoft-com:office:word" xmlns:w="http://schemas.openxmlformats.org/wordprocessingml/2006/main" xmlns:w14="http://schemas.microsoft.com/office/word/2010/wordml" xmlns:w15="http://schemas.microsoft.com/office/word/2012/wordml" xmlns:w16cex="http://schemas.microsoft.com/office/word/2018/wordml/cex" xmlns:w16cid="http://schemas.microsoft.com/office/word/2016/wordml/cid" xmlns:w16="http://schemas.microsoft.com/office/word/2018/wordml" xmlns:w16du="http://schemas.microsoft.com/office/word/2023/wordml/word16du" xmlns:w16sdtdh="http://schemas.microsoft.com/office/word/2020/wordml/sdtdatahash" xmlns:w16sdtfl="http://schemas.microsoft.com/office/word/2024/wordml/sdtformatlock" xmlns:w16se="http://schemas.microsoft.com/office/word/2015/wordml/symex" xmlns:wpg="http://schemas.microsoft.com/office/word/2010/wordprocessingGroup" xmlns:wpi="http://schemas.microsoft.com/office/word/2010/wordprocessingInk" xmlns:wne="http://schemas.microsoft.com/office/word/2006/wordml" xmlns:wps="http://schemas.microsoft.com/office/word/2010/wordprocessingShape" mc:Ignorable="w14 w15 w16se w16cid w16 w16cex w16sdtdh w16sdtfl w16du wp14">
   <w:abstractNum w:abstractNumId="0" w15:restartNumberingAfterBreak="0">
     <w:nsid w:val="0011328B"/>
     <w:multiLevelType w:val="hybridMultilevel"/>
@@ -13315,7 +13522,7 @@
 </file>
 
 <file path=word/styles.xml><?xml version="1.0" encoding="utf-8"?>
-<w:styles xmlns:mc="http://schemas.openxmlformats.org/markup-compatibility/2006" xmlns:r="http://schemas.openxmlformats.org/officeDocument/2006/relationships" xmlns:w="http://schemas.openxmlformats.org/wordprocessingml/2006/main" xmlns:w14="http://schemas.microsoft.com/office/word/2010/wordml" xmlns:w15="http://schemas.microsoft.com/office/word/2012/wordml" xmlns:w16cex="http://schemas.microsoft.com/office/word/2018/wordml/cex" xmlns:w16cid="http://schemas.microsoft.com/office/word/2016/wordml/cid" xmlns:w16="http://schemas.microsoft.com/office/word/2018/wordml" xmlns:w16du="http://schemas.microsoft.com/office/word/2023/wordml/word16du" xmlns:w16sdtdh="http://schemas.microsoft.com/office/word/2020/wordml/sdtdatahash" xmlns:w16se="http://schemas.microsoft.com/office/word/2015/wordml/symex" mc:Ignorable="w14 w15 w16se w16cid w16 w16cex w16sdtdh w16du">
+<w:styles xmlns:mc="http://schemas.openxmlformats.org/markup-compatibility/2006" xmlns:r="http://schemas.openxmlformats.org/officeDocument/2006/relationships" xmlns:w="http://schemas.openxmlformats.org/wordprocessingml/2006/main" xmlns:w14="http://schemas.microsoft.com/office/word/2010/wordml" xmlns:w15="http://schemas.microsoft.com/office/word/2012/wordml" xmlns:w16cex="http://schemas.microsoft.com/office/word/2018/wordml/cex" xmlns:w16cid="http://schemas.microsoft.com/office/word/2016/wordml/cid" xmlns:w16="http://schemas.microsoft.com/office/word/2018/wordml" xmlns:w16du="http://schemas.microsoft.com/office/word/2023/wordml/word16du" xmlns:w16sdtdh="http://schemas.microsoft.com/office/word/2020/wordml/sdtdatahash" xmlns:w16sdtfl="http://schemas.microsoft.com/office/word/2024/wordml/sdtformatlock" xmlns:w16se="http://schemas.microsoft.com/office/word/2015/wordml/symex" mc:Ignorable="w14 w15 w16se w16cid w16 w16cex w16sdtdh w16sdtfl w16du">
   <w:docDefaults>
     <w:rPrDefault>
       <w:rPr>

</xml_diff>

<commit_message>
plantillas word desde main
</commit_message>
<xml_diff>
--- a/Inputs/Templates/GRI BBVA.docx
+++ b/Inputs/Templates/GRI BBVA.docx
@@ -1,6 +1,6 @@
 
 <file path=word/document.xml><?xml version="1.0" encoding="utf-8"?>
-<w:document xmlns:wpc="http://schemas.microsoft.com/office/word/2010/wordprocessingCanvas" xmlns:cx="http://schemas.microsoft.com/office/drawing/2014/chartex" xmlns:cx1="http://schemas.microsoft.com/office/drawing/2015/9/8/chartex" xmlns:cx2="http://schemas.microsoft.com/office/drawing/2015/10/21/chartex" xmlns:cx3="http://schemas.microsoft.com/office/drawing/2016/5/9/chartex" xmlns:cx4="http://schemas.microsoft.com/office/drawing/2016/5/10/chartex" xmlns:cx5="http://schemas.microsoft.com/office/drawing/2016/5/11/chartex" xmlns:cx6="http://schemas.microsoft.com/office/drawing/2016/5/12/chartex" xmlns:cx7="http://schemas.microsoft.com/office/drawing/2016/5/13/chartex" xmlns:cx8="http://schemas.microsoft.com/office/drawing/2016/5/14/chartex" xmlns:mc="http://schemas.openxmlformats.org/markup-compatibility/2006" xmlns:aink="http://schemas.microsoft.com/office/drawing/2016/ink" xmlns:am3d="http://schemas.microsoft.com/office/drawing/2017/model3d" xmlns:o="urn:schemas-microsoft-com:office:office" xmlns:oel="http://schemas.microsoft.com/office/2019/extlst" xmlns:r="http://schemas.openxmlformats.org/officeDocument/2006/relationships" xmlns:m="http://schemas.openxmlformats.org/officeDocument/2006/math" xmlns:v="urn:schemas-microsoft-com:vml" xmlns:wp14="http://schemas.microsoft.com/office/word/2010/wordprocessingDrawing" xmlns:wp="http://schemas.openxmlformats.org/drawingml/2006/wordprocessingDrawing" xmlns:w10="urn:schemas-microsoft-com:office:word" xmlns:w="http://schemas.openxmlformats.org/wordprocessingml/2006/main" xmlns:w14="http://schemas.microsoft.com/office/word/2010/wordml" xmlns:w15="http://schemas.microsoft.com/office/word/2012/wordml" xmlns:w16cex="http://schemas.microsoft.com/office/word/2018/wordml/cex" xmlns:w16cid="http://schemas.microsoft.com/office/word/2016/wordml/cid" xmlns:w16="http://schemas.microsoft.com/office/word/2018/wordml" xmlns:w16du="http://schemas.microsoft.com/office/word/2023/wordml/word16du" xmlns:w16sdtdh="http://schemas.microsoft.com/office/word/2020/wordml/sdtdatahash" xmlns:w16se="http://schemas.microsoft.com/office/word/2015/wordml/symex" xmlns:wpg="http://schemas.microsoft.com/office/word/2010/wordprocessingGroup" xmlns:wpi="http://schemas.microsoft.com/office/word/2010/wordprocessingInk" xmlns:wne="http://schemas.microsoft.com/office/word/2006/wordml" xmlns:wps="http://schemas.microsoft.com/office/word/2010/wordprocessingShape" mc:Ignorable="w14 w15 w16se w16cid w16 w16cex w16sdtdh w16du wp14">
+<w:document xmlns:wpc="http://schemas.microsoft.com/office/word/2010/wordprocessingCanvas" xmlns:cx="http://schemas.microsoft.com/office/drawing/2014/chartex" xmlns:cx1="http://schemas.microsoft.com/office/drawing/2015/9/8/chartex" xmlns:cx2="http://schemas.microsoft.com/office/drawing/2015/10/21/chartex" xmlns:cx3="http://schemas.microsoft.com/office/drawing/2016/5/9/chartex" xmlns:cx4="http://schemas.microsoft.com/office/drawing/2016/5/10/chartex" xmlns:cx5="http://schemas.microsoft.com/office/drawing/2016/5/11/chartex" xmlns:cx6="http://schemas.microsoft.com/office/drawing/2016/5/12/chartex" xmlns:cx7="http://schemas.microsoft.com/office/drawing/2016/5/13/chartex" xmlns:cx8="http://schemas.microsoft.com/office/drawing/2016/5/14/chartex" xmlns:mc="http://schemas.openxmlformats.org/markup-compatibility/2006" xmlns:aink="http://schemas.microsoft.com/office/drawing/2016/ink" xmlns:am3d="http://schemas.microsoft.com/office/drawing/2017/model3d" xmlns:o="urn:schemas-microsoft-com:office:office" xmlns:oel="http://schemas.microsoft.com/office/2019/extlst" xmlns:r="http://schemas.openxmlformats.org/officeDocument/2006/relationships" xmlns:m="http://schemas.openxmlformats.org/officeDocument/2006/math" xmlns:v="urn:schemas-microsoft-com:vml" xmlns:wp14="http://schemas.microsoft.com/office/word/2010/wordprocessingDrawing" xmlns:wp="http://schemas.openxmlformats.org/drawingml/2006/wordprocessingDrawing" xmlns:w10="urn:schemas-microsoft-com:office:word" xmlns:w="http://schemas.openxmlformats.org/wordprocessingml/2006/main" xmlns:w14="http://schemas.microsoft.com/office/word/2010/wordml" xmlns:w15="http://schemas.microsoft.com/office/word/2012/wordml" xmlns:w16cex="http://schemas.microsoft.com/office/word/2018/wordml/cex" xmlns:w16cid="http://schemas.microsoft.com/office/word/2016/wordml/cid" xmlns:w16="http://schemas.microsoft.com/office/word/2018/wordml" xmlns:w16du="http://schemas.microsoft.com/office/word/2023/wordml/word16du" xmlns:w16sdtdh="http://schemas.microsoft.com/office/word/2020/wordml/sdtdatahash" xmlns:w16sdtfl="http://schemas.microsoft.com/office/word/2024/wordml/sdtformatlock" xmlns:w16se="http://schemas.microsoft.com/office/word/2015/wordml/symex" xmlns:wpg="http://schemas.microsoft.com/office/word/2010/wordprocessingGroup" xmlns:wpi="http://schemas.microsoft.com/office/word/2010/wordprocessingInk" xmlns:wne="http://schemas.microsoft.com/office/word/2006/wordml" xmlns:wps="http://schemas.microsoft.com/office/word/2010/wordprocessingShape" mc:Ignorable="w14 w15 w16se w16cid w16 w16cex w16sdtdh w16sdtfl w16du wp14">
   <w:body>
     <w:tbl>
       <w:tblPr>
@@ -264,36 +264,6 @@
                 <w:sz w:val="32"/>
               </w:rPr>
               <w:t>no_exterior</w:t>
-            </w:r>
-            <w:proofErr w:type="spellEnd"/>
-            <w:r>
-              <w:rPr>
-                <w:color w:val="767171" w:themeColor="background2" w:themeShade="80"/>
-                <w:sz w:val="32"/>
-              </w:rPr>
-              <w:t xml:space="preserve"> }}</w:t>
-            </w:r>
-            <w:r>
-              <w:rPr>
-                <w:color w:val="767171" w:themeColor="background2" w:themeShade="80"/>
-                <w:sz w:val="32"/>
-              </w:rPr>
-              <w:t xml:space="preserve"> </w:t>
-            </w:r>
-            <w:r>
-              <w:rPr>
-                <w:color w:val="767171" w:themeColor="background2" w:themeShade="80"/>
-                <w:sz w:val="32"/>
-              </w:rPr>
-              <w:t xml:space="preserve">{{ </w:t>
-            </w:r>
-            <w:proofErr w:type="spellStart"/>
-            <w:r>
-              <w:rPr>
-                <w:color w:val="767171" w:themeColor="background2" w:themeShade="80"/>
-                <w:sz w:val="32"/>
-              </w:rPr>
-              <w:t>no_interior</w:t>
             </w:r>
             <w:proofErr w:type="spellEnd"/>
             <w:r>
@@ -3803,7 +3773,51 @@
                       <w:sz w:val="26"/>
                       <w:szCs w:val="26"/>
                     </w:rPr>
-                    <m:t>{{ gas_inflamable }}</m:t>
+                    <m:t xml:space="preserve">{{ </m:t>
+                  </m:r>
+                  <m:r>
+                    <m:rPr>
+                      <m:sty m:val="bi"/>
+                    </m:rPr>
+                    <w:rPr>
+                      <w:rFonts w:ascii="Cambria Math" w:hAnsi="Cambria Math"/>
+                      <w:sz w:val="26"/>
+                      <w:szCs w:val="26"/>
+                    </w:rPr>
+                    <m:t>gas</m:t>
+                  </m:r>
+                  <m:r>
+                    <m:rPr>
+                      <m:sty m:val="bi"/>
+                    </m:rPr>
+                    <w:rPr>
+                      <w:rFonts w:ascii="Cambria Math" w:hAnsi="Cambria Math"/>
+                      <w:sz w:val="26"/>
+                      <w:szCs w:val="26"/>
+                    </w:rPr>
+                    <m:t>_</m:t>
+                  </m:r>
+                  <m:r>
+                    <m:rPr>
+                      <m:sty m:val="bi"/>
+                    </m:rPr>
+                    <w:rPr>
+                      <w:rFonts w:ascii="Cambria Math" w:hAnsi="Cambria Math"/>
+                      <w:sz w:val="26"/>
+                      <w:szCs w:val="26"/>
+                    </w:rPr>
+                    <m:t>inflamable</m:t>
+                  </m:r>
+                  <m:r>
+                    <m:rPr>
+                      <m:sty m:val="bi"/>
+                    </m:rPr>
+                    <w:rPr>
+                      <w:rFonts w:ascii="Cambria Math" w:hAnsi="Cambria Math"/>
+                      <w:sz w:val="26"/>
+                      <w:szCs w:val="26"/>
+                    </w:rPr>
+                    <m:t xml:space="preserve"> }}</m:t>
                   </m:r>
                 </m:num>
                 <m:den>
@@ -3816,7 +3830,29 @@
                       <w:sz w:val="26"/>
                       <w:szCs w:val="26"/>
                     </w:rPr>
-                    <m:t>3000 litros</m:t>
+                    <m:t>3000</m:t>
+                  </m:r>
+                  <m:r>
+                    <m:rPr>
+                      <m:sty m:val="bi"/>
+                    </m:rPr>
+                    <w:rPr>
+                      <w:rFonts w:ascii="Cambria Math" w:hAnsi="Cambria Math"/>
+                      <w:sz w:val="26"/>
+                      <w:szCs w:val="26"/>
+                    </w:rPr>
+                    <m:t xml:space="preserve"> </m:t>
+                  </m:r>
+                  <m:r>
+                    <m:rPr>
+                      <m:sty m:val="bi"/>
+                    </m:rPr>
+                    <w:rPr>
+                      <w:rFonts w:ascii="Cambria Math" w:hAnsi="Cambria Math"/>
+                      <w:sz w:val="26"/>
+                      <w:szCs w:val="26"/>
+                    </w:rPr>
+                    <m:t>litros</m:t>
                   </m:r>
                 </m:den>
               </m:f>
@@ -3868,7 +3904,51 @@
                       <w:sz w:val="26"/>
                       <w:szCs w:val="26"/>
                     </w:rPr>
-                    <m:t>{{ liquido_inflamable }}</m:t>
+                    <m:t xml:space="preserve">{{ </m:t>
+                  </m:r>
+                  <m:r>
+                    <m:rPr>
+                      <m:sty m:val="bi"/>
+                    </m:rPr>
+                    <w:rPr>
+                      <w:rFonts w:ascii="Cambria Math" w:hAnsi="Cambria Math"/>
+                      <w:sz w:val="26"/>
+                      <w:szCs w:val="26"/>
+                    </w:rPr>
+                    <m:t>liquido</m:t>
+                  </m:r>
+                  <m:r>
+                    <m:rPr>
+                      <m:sty m:val="bi"/>
+                    </m:rPr>
+                    <w:rPr>
+                      <w:rFonts w:ascii="Cambria Math" w:hAnsi="Cambria Math"/>
+                      <w:sz w:val="26"/>
+                      <w:szCs w:val="26"/>
+                    </w:rPr>
+                    <m:t>_</m:t>
+                  </m:r>
+                  <m:r>
+                    <m:rPr>
+                      <m:sty m:val="bi"/>
+                    </m:rPr>
+                    <w:rPr>
+                      <w:rFonts w:ascii="Cambria Math" w:hAnsi="Cambria Math"/>
+                      <w:sz w:val="26"/>
+                      <w:szCs w:val="26"/>
+                    </w:rPr>
+                    <m:t>inflamable</m:t>
+                  </m:r>
+                  <m:r>
+                    <m:rPr>
+                      <m:sty m:val="bi"/>
+                    </m:rPr>
+                    <w:rPr>
+                      <w:rFonts w:ascii="Cambria Math" w:hAnsi="Cambria Math"/>
+                      <w:sz w:val="26"/>
+                      <w:szCs w:val="26"/>
+                    </w:rPr>
+                    <m:t xml:space="preserve"> }}</m:t>
                   </m:r>
                 </m:num>
                 <m:den>
@@ -3881,7 +3961,29 @@
                       <w:sz w:val="26"/>
                       <w:szCs w:val="26"/>
                     </w:rPr>
-                    <m:t>1400 litros</m:t>
+                    <m:t>1400</m:t>
+                  </m:r>
+                  <m:r>
+                    <m:rPr>
+                      <m:sty m:val="bi"/>
+                    </m:rPr>
+                    <w:rPr>
+                      <w:rFonts w:ascii="Cambria Math" w:hAnsi="Cambria Math"/>
+                      <w:sz w:val="26"/>
+                      <w:szCs w:val="26"/>
+                    </w:rPr>
+                    <m:t xml:space="preserve"> </m:t>
+                  </m:r>
+                  <m:r>
+                    <m:rPr>
+                      <m:sty m:val="bi"/>
+                    </m:rPr>
+                    <w:rPr>
+                      <w:rFonts w:ascii="Cambria Math" w:hAnsi="Cambria Math"/>
+                      <w:sz w:val="26"/>
+                      <w:szCs w:val="26"/>
+                    </w:rPr>
+                    <m:t>litros</m:t>
                   </m:r>
                 </m:den>
               </m:f>
@@ -3933,7 +4035,51 @@
                       <w:sz w:val="26"/>
                       <w:szCs w:val="26"/>
                     </w:rPr>
-                    <m:t>{{ liquido_combustible }}</m:t>
+                    <m:t xml:space="preserve">{{ </m:t>
+                  </m:r>
+                  <m:r>
+                    <m:rPr>
+                      <m:sty m:val="bi"/>
+                    </m:rPr>
+                    <w:rPr>
+                      <w:rFonts w:ascii="Cambria Math" w:hAnsi="Cambria Math"/>
+                      <w:sz w:val="26"/>
+                      <w:szCs w:val="26"/>
+                    </w:rPr>
+                    <m:t>liquido</m:t>
+                  </m:r>
+                  <m:r>
+                    <m:rPr>
+                      <m:sty m:val="bi"/>
+                    </m:rPr>
+                    <w:rPr>
+                      <w:rFonts w:ascii="Cambria Math" w:hAnsi="Cambria Math"/>
+                      <w:sz w:val="26"/>
+                      <w:szCs w:val="26"/>
+                    </w:rPr>
+                    <m:t>_</m:t>
+                  </m:r>
+                  <m:r>
+                    <m:rPr>
+                      <m:sty m:val="bi"/>
+                    </m:rPr>
+                    <w:rPr>
+                      <w:rFonts w:ascii="Cambria Math" w:hAnsi="Cambria Math"/>
+                      <w:sz w:val="26"/>
+                      <w:szCs w:val="26"/>
+                    </w:rPr>
+                    <m:t>combustible</m:t>
+                  </m:r>
+                  <m:r>
+                    <m:rPr>
+                      <m:sty m:val="bi"/>
+                    </m:rPr>
+                    <w:rPr>
+                      <w:rFonts w:ascii="Cambria Math" w:hAnsi="Cambria Math"/>
+                      <w:sz w:val="26"/>
+                      <w:szCs w:val="26"/>
+                    </w:rPr>
+                    <m:t xml:space="preserve"> }}</m:t>
                   </m:r>
                 </m:num>
                 <m:den>
@@ -3946,7 +4092,29 @@
                       <w:sz w:val="26"/>
                       <w:szCs w:val="26"/>
                     </w:rPr>
-                    <m:t>2000 litros</m:t>
+                    <m:t>2000</m:t>
+                  </m:r>
+                  <m:r>
+                    <m:rPr>
+                      <m:sty m:val="bi"/>
+                    </m:rPr>
+                    <w:rPr>
+                      <w:rFonts w:ascii="Cambria Math" w:hAnsi="Cambria Math"/>
+                      <w:sz w:val="26"/>
+                      <w:szCs w:val="26"/>
+                    </w:rPr>
+                    <m:t xml:space="preserve"> </m:t>
+                  </m:r>
+                  <m:r>
+                    <m:rPr>
+                      <m:sty m:val="bi"/>
+                    </m:rPr>
+                    <w:rPr>
+                      <w:rFonts w:ascii="Cambria Math" w:hAnsi="Cambria Math"/>
+                      <w:sz w:val="26"/>
+                      <w:szCs w:val="26"/>
+                    </w:rPr>
+                    <m:t>litros</m:t>
                   </m:r>
                 </m:den>
               </m:f>
@@ -3998,7 +4166,62 @@
                       <w:sz w:val="26"/>
                       <w:szCs w:val="26"/>
                     </w:rPr>
-                    <m:t>{{ solido_combusible }} kg</m:t>
+                    <m:t xml:space="preserve">{{ </m:t>
+                  </m:r>
+                  <m:r>
+                    <m:rPr>
+                      <m:sty m:val="bi"/>
+                    </m:rPr>
+                    <w:rPr>
+                      <w:rFonts w:ascii="Cambria Math" w:hAnsi="Cambria Math"/>
+                      <w:sz w:val="26"/>
+                      <w:szCs w:val="26"/>
+                    </w:rPr>
+                    <m:t>solido</m:t>
+                  </m:r>
+                  <m:r>
+                    <m:rPr>
+                      <m:sty m:val="bi"/>
+                    </m:rPr>
+                    <w:rPr>
+                      <w:rFonts w:ascii="Cambria Math" w:hAnsi="Cambria Math"/>
+                      <w:sz w:val="26"/>
+                      <w:szCs w:val="26"/>
+                    </w:rPr>
+                    <m:t>_</m:t>
+                  </m:r>
+                  <m:r>
+                    <m:rPr>
+                      <m:sty m:val="bi"/>
+                    </m:rPr>
+                    <w:rPr>
+                      <w:rFonts w:ascii="Cambria Math" w:hAnsi="Cambria Math"/>
+                      <w:sz w:val="26"/>
+                      <w:szCs w:val="26"/>
+                    </w:rPr>
+                    <m:t>combusible</m:t>
+                  </m:r>
+                  <m:r>
+                    <m:rPr>
+                      <m:sty m:val="bi"/>
+                    </m:rPr>
+                    <w:rPr>
+                      <w:rFonts w:ascii="Cambria Math" w:hAnsi="Cambria Math"/>
+                      <w:sz w:val="26"/>
+                      <w:szCs w:val="26"/>
+                    </w:rPr>
+                    <m:t xml:space="preserve"> }} </m:t>
+                  </m:r>
+                  <m:r>
+                    <m:rPr>
+                      <m:sty m:val="bi"/>
+                    </m:rPr>
+                    <w:rPr>
+                      <w:rFonts w:ascii="Cambria Math" w:hAnsi="Cambria Math"/>
+                      <w:sz w:val="26"/>
+                      <w:szCs w:val="26"/>
+                    </w:rPr>
+                    <m:t>kg</m:t>
                   </m:r>
                 </m:num>
                 <m:den>
@@ -4011,7 +4234,29 @@
                       <w:sz w:val="26"/>
                       <w:szCs w:val="26"/>
                     </w:rPr>
-                    <m:t>15000 kg</m:t>
+                    <m:t>15000</m:t>
+                  </m:r>
+                  <m:r>
+                    <m:rPr>
+                      <m:sty m:val="bi"/>
+                    </m:rPr>
+                    <w:rPr>
+                      <w:rFonts w:ascii="Cambria Math" w:hAnsi="Cambria Math"/>
+                      <w:sz w:val="26"/>
+                      <w:szCs w:val="26"/>
+                    </w:rPr>
+                    <m:t xml:space="preserve"> </m:t>
+                  </m:r>
+                  <m:r>
+                    <m:rPr>
+                      <m:sty m:val="bi"/>
+                    </m:rPr>
+                    <w:rPr>
+                      <w:rFonts w:ascii="Cambria Math" w:hAnsi="Cambria Math"/>
+                      <w:sz w:val="26"/>
+                      <w:szCs w:val="26"/>
+                    </w:rPr>
+                    <m:t>kg</m:t>
                   </m:r>
                 </m:den>
               </m:f>
@@ -4026,7 +4271,51 @@
               <w:sz w:val="26"/>
               <w:szCs w:val="26"/>
             </w:rPr>
-            <m:t>= {{ valor_gri }}</m:t>
+            <m:t xml:space="preserve">= {{ </m:t>
+          </m:r>
+          <m:r>
+            <m:rPr>
+              <m:sty m:val="bi"/>
+            </m:rPr>
+            <w:rPr>
+              <w:rFonts w:ascii="Cambria Math" w:hAnsi="Cambria Math"/>
+              <w:sz w:val="26"/>
+              <w:szCs w:val="26"/>
+            </w:rPr>
+            <m:t>valor</m:t>
+          </m:r>
+          <m:r>
+            <m:rPr>
+              <m:sty m:val="bi"/>
+            </m:rPr>
+            <w:rPr>
+              <w:rFonts w:ascii="Cambria Math" w:hAnsi="Cambria Math"/>
+              <w:sz w:val="26"/>
+              <w:szCs w:val="26"/>
+            </w:rPr>
+            <m:t>_</m:t>
+          </m:r>
+          <m:r>
+            <m:rPr>
+              <m:sty m:val="bi"/>
+            </m:rPr>
+            <w:rPr>
+              <w:rFonts w:ascii="Cambria Math" w:hAnsi="Cambria Math"/>
+              <w:sz w:val="26"/>
+              <w:szCs w:val="26"/>
+            </w:rPr>
+            <m:t>gri</m:t>
+          </m:r>
+          <m:r>
+            <m:rPr>
+              <m:sty m:val="bi"/>
+            </m:rPr>
+            <w:rPr>
+              <w:rFonts w:ascii="Cambria Math" w:hAnsi="Cambria Math"/>
+              <w:sz w:val="26"/>
+              <w:szCs w:val="26"/>
+            </w:rPr>
+            <m:t xml:space="preserve"> }}</m:t>
           </m:r>
         </m:oMath>
       </m:oMathPara>
@@ -9910,7 +10199,7 @@
 </file>
 
 <file path=word/endnotes.xml><?xml version="1.0" encoding="utf-8"?>
-<w:endnotes xmlns:wpc="http://schemas.microsoft.com/office/word/2010/wordprocessingCanvas" xmlns:cx="http://schemas.microsoft.com/office/drawing/2014/chartex" xmlns:cx1="http://schemas.microsoft.com/office/drawing/2015/9/8/chartex" xmlns:cx2="http://schemas.microsoft.com/office/drawing/2015/10/21/chartex" xmlns:cx3="http://schemas.microsoft.com/office/drawing/2016/5/9/chartex" xmlns:cx4="http://schemas.microsoft.com/office/drawing/2016/5/10/chartex" xmlns:cx5="http://schemas.microsoft.com/office/drawing/2016/5/11/chartex" xmlns:cx6="http://schemas.microsoft.com/office/drawing/2016/5/12/chartex" xmlns:cx7="http://schemas.microsoft.com/office/drawing/2016/5/13/chartex" xmlns:cx8="http://schemas.microsoft.com/office/drawing/2016/5/14/chartex" xmlns:mc="http://schemas.openxmlformats.org/markup-compatibility/2006" xmlns:aink="http://schemas.microsoft.com/office/drawing/2016/ink" xmlns:am3d="http://schemas.microsoft.com/office/drawing/2017/model3d" xmlns:o="urn:schemas-microsoft-com:office:office" xmlns:oel="http://schemas.microsoft.com/office/2019/extlst" xmlns:r="http://schemas.openxmlformats.org/officeDocument/2006/relationships" xmlns:m="http://schemas.openxmlformats.org/officeDocument/2006/math" xmlns:v="urn:schemas-microsoft-com:vml" xmlns:wp14="http://schemas.microsoft.com/office/word/2010/wordprocessingDrawing" xmlns:wp="http://schemas.openxmlformats.org/drawingml/2006/wordprocessingDrawing" xmlns:w10="urn:schemas-microsoft-com:office:word" xmlns:w="http://schemas.openxmlformats.org/wordprocessingml/2006/main" xmlns:w14="http://schemas.microsoft.com/office/word/2010/wordml" xmlns:w15="http://schemas.microsoft.com/office/word/2012/wordml" xmlns:w16cex="http://schemas.microsoft.com/office/word/2018/wordml/cex" xmlns:w16cid="http://schemas.microsoft.com/office/word/2016/wordml/cid" xmlns:w16="http://schemas.microsoft.com/office/word/2018/wordml" xmlns:w16du="http://schemas.microsoft.com/office/word/2023/wordml/word16du" xmlns:w16sdtdh="http://schemas.microsoft.com/office/word/2020/wordml/sdtdatahash" xmlns:w16se="http://schemas.microsoft.com/office/word/2015/wordml/symex" xmlns:wpg="http://schemas.microsoft.com/office/word/2010/wordprocessingGroup" xmlns:wpi="http://schemas.microsoft.com/office/word/2010/wordprocessingInk" xmlns:wne="http://schemas.microsoft.com/office/word/2006/wordml" xmlns:wps="http://schemas.microsoft.com/office/word/2010/wordprocessingShape" mc:Ignorable="w14 w15 w16se w16cid w16 w16cex w16sdtdh w16du wp14">
+<w:endnotes xmlns:wpc="http://schemas.microsoft.com/office/word/2010/wordprocessingCanvas" xmlns:cx="http://schemas.microsoft.com/office/drawing/2014/chartex" xmlns:cx1="http://schemas.microsoft.com/office/drawing/2015/9/8/chartex" xmlns:cx2="http://schemas.microsoft.com/office/drawing/2015/10/21/chartex" xmlns:cx3="http://schemas.microsoft.com/office/drawing/2016/5/9/chartex" xmlns:cx4="http://schemas.microsoft.com/office/drawing/2016/5/10/chartex" xmlns:cx5="http://schemas.microsoft.com/office/drawing/2016/5/11/chartex" xmlns:cx6="http://schemas.microsoft.com/office/drawing/2016/5/12/chartex" xmlns:cx7="http://schemas.microsoft.com/office/drawing/2016/5/13/chartex" xmlns:cx8="http://schemas.microsoft.com/office/drawing/2016/5/14/chartex" xmlns:mc="http://schemas.openxmlformats.org/markup-compatibility/2006" xmlns:aink="http://schemas.microsoft.com/office/drawing/2016/ink" xmlns:am3d="http://schemas.microsoft.com/office/drawing/2017/model3d" xmlns:o="urn:schemas-microsoft-com:office:office" xmlns:oel="http://schemas.microsoft.com/office/2019/extlst" xmlns:r="http://schemas.openxmlformats.org/officeDocument/2006/relationships" xmlns:m="http://schemas.openxmlformats.org/officeDocument/2006/math" xmlns:v="urn:schemas-microsoft-com:vml" xmlns:wp14="http://schemas.microsoft.com/office/word/2010/wordprocessingDrawing" xmlns:wp="http://schemas.openxmlformats.org/drawingml/2006/wordprocessingDrawing" xmlns:w10="urn:schemas-microsoft-com:office:word" xmlns:w="http://schemas.openxmlformats.org/wordprocessingml/2006/main" xmlns:w14="http://schemas.microsoft.com/office/word/2010/wordml" xmlns:w15="http://schemas.microsoft.com/office/word/2012/wordml" xmlns:w16cex="http://schemas.microsoft.com/office/word/2018/wordml/cex" xmlns:w16cid="http://schemas.microsoft.com/office/word/2016/wordml/cid" xmlns:w16="http://schemas.microsoft.com/office/word/2018/wordml" xmlns:w16du="http://schemas.microsoft.com/office/word/2023/wordml/word16du" xmlns:w16sdtdh="http://schemas.microsoft.com/office/word/2020/wordml/sdtdatahash" xmlns:w16sdtfl="http://schemas.microsoft.com/office/word/2024/wordml/sdtformatlock" xmlns:w16se="http://schemas.microsoft.com/office/word/2015/wordml/symex" xmlns:wpg="http://schemas.microsoft.com/office/word/2010/wordprocessingGroup" xmlns:wpi="http://schemas.microsoft.com/office/word/2010/wordprocessingInk" xmlns:wne="http://schemas.microsoft.com/office/word/2006/wordml" xmlns:wps="http://schemas.microsoft.com/office/word/2010/wordprocessingShape" mc:Ignorable="w14 w15 w16se w16cid w16 w16cex w16sdtdh w16sdtfl w16du wp14">
   <w:endnote w:type="separator" w:id="-1">
     <w:p>
       <w:pPr>
@@ -9942,7 +10231,7 @@
 </file>
 
 <file path=word/footer1.xml><?xml version="1.0" encoding="utf-8"?>
-<w:ftr xmlns:wpc="http://schemas.microsoft.com/office/word/2010/wordprocessingCanvas" xmlns:cx="http://schemas.microsoft.com/office/drawing/2014/chartex" xmlns:cx1="http://schemas.microsoft.com/office/drawing/2015/9/8/chartex" xmlns:cx2="http://schemas.microsoft.com/office/drawing/2015/10/21/chartex" xmlns:cx3="http://schemas.microsoft.com/office/drawing/2016/5/9/chartex" xmlns:cx4="http://schemas.microsoft.com/office/drawing/2016/5/10/chartex" xmlns:cx5="http://schemas.microsoft.com/office/drawing/2016/5/11/chartex" xmlns:cx6="http://schemas.microsoft.com/office/drawing/2016/5/12/chartex" xmlns:cx7="http://schemas.microsoft.com/office/drawing/2016/5/13/chartex" xmlns:cx8="http://schemas.microsoft.com/office/drawing/2016/5/14/chartex" xmlns:mc="http://schemas.openxmlformats.org/markup-compatibility/2006" xmlns:aink="http://schemas.microsoft.com/office/drawing/2016/ink" xmlns:am3d="http://schemas.microsoft.com/office/drawing/2017/model3d" xmlns:o="urn:schemas-microsoft-com:office:office" xmlns:oel="http://schemas.microsoft.com/office/2019/extlst" xmlns:r="http://schemas.openxmlformats.org/officeDocument/2006/relationships" xmlns:m="http://schemas.openxmlformats.org/officeDocument/2006/math" xmlns:v="urn:schemas-microsoft-com:vml" xmlns:wp14="http://schemas.microsoft.com/office/word/2010/wordprocessingDrawing" xmlns:wp="http://schemas.openxmlformats.org/drawingml/2006/wordprocessingDrawing" xmlns:w10="urn:schemas-microsoft-com:office:word" xmlns:w="http://schemas.openxmlformats.org/wordprocessingml/2006/main" xmlns:w14="http://schemas.microsoft.com/office/word/2010/wordml" xmlns:w15="http://schemas.microsoft.com/office/word/2012/wordml" xmlns:w16cex="http://schemas.microsoft.com/office/word/2018/wordml/cex" xmlns:w16cid="http://schemas.microsoft.com/office/word/2016/wordml/cid" xmlns:w16="http://schemas.microsoft.com/office/word/2018/wordml" xmlns:w16du="http://schemas.microsoft.com/office/word/2023/wordml/word16du" xmlns:w16sdtdh="http://schemas.microsoft.com/office/word/2020/wordml/sdtdatahash" xmlns:w16se="http://schemas.microsoft.com/office/word/2015/wordml/symex" xmlns:wpg="http://schemas.microsoft.com/office/word/2010/wordprocessingGroup" xmlns:wpi="http://schemas.microsoft.com/office/word/2010/wordprocessingInk" xmlns:wne="http://schemas.microsoft.com/office/word/2006/wordml" xmlns:wps="http://schemas.microsoft.com/office/word/2010/wordprocessingShape" mc:Ignorable="w14 w15 w16se w16cid w16 w16cex w16sdtdh w16du wp14">
+<w:ftr xmlns:wpc="http://schemas.microsoft.com/office/word/2010/wordprocessingCanvas" xmlns:cx="http://schemas.microsoft.com/office/drawing/2014/chartex" xmlns:cx1="http://schemas.microsoft.com/office/drawing/2015/9/8/chartex" xmlns:cx2="http://schemas.microsoft.com/office/drawing/2015/10/21/chartex" xmlns:cx3="http://schemas.microsoft.com/office/drawing/2016/5/9/chartex" xmlns:cx4="http://schemas.microsoft.com/office/drawing/2016/5/10/chartex" xmlns:cx5="http://schemas.microsoft.com/office/drawing/2016/5/11/chartex" xmlns:cx6="http://schemas.microsoft.com/office/drawing/2016/5/12/chartex" xmlns:cx7="http://schemas.microsoft.com/office/drawing/2016/5/13/chartex" xmlns:cx8="http://schemas.microsoft.com/office/drawing/2016/5/14/chartex" xmlns:mc="http://schemas.openxmlformats.org/markup-compatibility/2006" xmlns:aink="http://schemas.microsoft.com/office/drawing/2016/ink" xmlns:am3d="http://schemas.microsoft.com/office/drawing/2017/model3d" xmlns:o="urn:schemas-microsoft-com:office:office" xmlns:oel="http://schemas.microsoft.com/office/2019/extlst" xmlns:r="http://schemas.openxmlformats.org/officeDocument/2006/relationships" xmlns:m="http://schemas.openxmlformats.org/officeDocument/2006/math" xmlns:v="urn:schemas-microsoft-com:vml" xmlns:wp14="http://schemas.microsoft.com/office/word/2010/wordprocessingDrawing" xmlns:wp="http://schemas.openxmlformats.org/drawingml/2006/wordprocessingDrawing" xmlns:w10="urn:schemas-microsoft-com:office:word" xmlns:w="http://schemas.openxmlformats.org/wordprocessingml/2006/main" xmlns:w14="http://schemas.microsoft.com/office/word/2010/wordml" xmlns:w15="http://schemas.microsoft.com/office/word/2012/wordml" xmlns:w16cex="http://schemas.microsoft.com/office/word/2018/wordml/cex" xmlns:w16cid="http://schemas.microsoft.com/office/word/2016/wordml/cid" xmlns:w16="http://schemas.microsoft.com/office/word/2018/wordml" xmlns:w16du="http://schemas.microsoft.com/office/word/2023/wordml/word16du" xmlns:w16sdtdh="http://schemas.microsoft.com/office/word/2020/wordml/sdtdatahash" xmlns:w16sdtfl="http://schemas.microsoft.com/office/word/2024/wordml/sdtformatlock" xmlns:w16se="http://schemas.microsoft.com/office/word/2015/wordml/symex" xmlns:wpg="http://schemas.microsoft.com/office/word/2010/wordprocessingGroup" xmlns:wpi="http://schemas.microsoft.com/office/word/2010/wordprocessingInk" xmlns:wne="http://schemas.microsoft.com/office/word/2006/wordml" xmlns:wps="http://schemas.microsoft.com/office/word/2010/wordprocessingShape" mc:Ignorable="w14 w15 w16se w16cid w16 w16cex w16sdtdh w16sdtfl w16du wp14">
   <w:sdt>
     <w:sdtPr>
       <w:id w:val="-470131145"/>
@@ -10012,7 +10301,7 @@
 </file>
 
 <file path=word/footnotes.xml><?xml version="1.0" encoding="utf-8"?>
-<w:footnotes xmlns:wpc="http://schemas.microsoft.com/office/word/2010/wordprocessingCanvas" xmlns:cx="http://schemas.microsoft.com/office/drawing/2014/chartex" xmlns:cx1="http://schemas.microsoft.com/office/drawing/2015/9/8/chartex" xmlns:cx2="http://schemas.microsoft.com/office/drawing/2015/10/21/chartex" xmlns:cx3="http://schemas.microsoft.com/office/drawing/2016/5/9/chartex" xmlns:cx4="http://schemas.microsoft.com/office/drawing/2016/5/10/chartex" xmlns:cx5="http://schemas.microsoft.com/office/drawing/2016/5/11/chartex" xmlns:cx6="http://schemas.microsoft.com/office/drawing/2016/5/12/chartex" xmlns:cx7="http://schemas.microsoft.com/office/drawing/2016/5/13/chartex" xmlns:cx8="http://schemas.microsoft.com/office/drawing/2016/5/14/chartex" xmlns:mc="http://schemas.openxmlformats.org/markup-compatibility/2006" xmlns:aink="http://schemas.microsoft.com/office/drawing/2016/ink" xmlns:am3d="http://schemas.microsoft.com/office/drawing/2017/model3d" xmlns:o="urn:schemas-microsoft-com:office:office" xmlns:oel="http://schemas.microsoft.com/office/2019/extlst" xmlns:r="http://schemas.openxmlformats.org/officeDocument/2006/relationships" xmlns:m="http://schemas.openxmlformats.org/officeDocument/2006/math" xmlns:v="urn:schemas-microsoft-com:vml" xmlns:wp14="http://schemas.microsoft.com/office/word/2010/wordprocessingDrawing" xmlns:wp="http://schemas.openxmlformats.org/drawingml/2006/wordprocessingDrawing" xmlns:w10="urn:schemas-microsoft-com:office:word" xmlns:w="http://schemas.openxmlformats.org/wordprocessingml/2006/main" xmlns:w14="http://schemas.microsoft.com/office/word/2010/wordml" xmlns:w15="http://schemas.microsoft.com/office/word/2012/wordml" xmlns:w16cex="http://schemas.microsoft.com/office/word/2018/wordml/cex" xmlns:w16cid="http://schemas.microsoft.com/office/word/2016/wordml/cid" xmlns:w16="http://schemas.microsoft.com/office/word/2018/wordml" xmlns:w16du="http://schemas.microsoft.com/office/word/2023/wordml/word16du" xmlns:w16sdtdh="http://schemas.microsoft.com/office/word/2020/wordml/sdtdatahash" xmlns:w16se="http://schemas.microsoft.com/office/word/2015/wordml/symex" xmlns:wpg="http://schemas.microsoft.com/office/word/2010/wordprocessingGroup" xmlns:wpi="http://schemas.microsoft.com/office/word/2010/wordprocessingInk" xmlns:wne="http://schemas.microsoft.com/office/word/2006/wordml" xmlns:wps="http://schemas.microsoft.com/office/word/2010/wordprocessingShape" mc:Ignorable="w14 w15 w16se w16cid w16 w16cex w16sdtdh w16du wp14">
+<w:footnotes xmlns:wpc="http://schemas.microsoft.com/office/word/2010/wordprocessingCanvas" xmlns:cx="http://schemas.microsoft.com/office/drawing/2014/chartex" xmlns:cx1="http://schemas.microsoft.com/office/drawing/2015/9/8/chartex" xmlns:cx2="http://schemas.microsoft.com/office/drawing/2015/10/21/chartex" xmlns:cx3="http://schemas.microsoft.com/office/drawing/2016/5/9/chartex" xmlns:cx4="http://schemas.microsoft.com/office/drawing/2016/5/10/chartex" xmlns:cx5="http://schemas.microsoft.com/office/drawing/2016/5/11/chartex" xmlns:cx6="http://schemas.microsoft.com/office/drawing/2016/5/12/chartex" xmlns:cx7="http://schemas.microsoft.com/office/drawing/2016/5/13/chartex" xmlns:cx8="http://schemas.microsoft.com/office/drawing/2016/5/14/chartex" xmlns:mc="http://schemas.openxmlformats.org/markup-compatibility/2006" xmlns:aink="http://schemas.microsoft.com/office/drawing/2016/ink" xmlns:am3d="http://schemas.microsoft.com/office/drawing/2017/model3d" xmlns:o="urn:schemas-microsoft-com:office:office" xmlns:oel="http://schemas.microsoft.com/office/2019/extlst" xmlns:r="http://schemas.openxmlformats.org/officeDocument/2006/relationships" xmlns:m="http://schemas.openxmlformats.org/officeDocument/2006/math" xmlns:v="urn:schemas-microsoft-com:vml" xmlns:wp14="http://schemas.microsoft.com/office/word/2010/wordprocessingDrawing" xmlns:wp="http://schemas.openxmlformats.org/drawingml/2006/wordprocessingDrawing" xmlns:w10="urn:schemas-microsoft-com:office:word" xmlns:w="http://schemas.openxmlformats.org/wordprocessingml/2006/main" xmlns:w14="http://schemas.microsoft.com/office/word/2010/wordml" xmlns:w15="http://schemas.microsoft.com/office/word/2012/wordml" xmlns:w16cex="http://schemas.microsoft.com/office/word/2018/wordml/cex" xmlns:w16cid="http://schemas.microsoft.com/office/word/2016/wordml/cid" xmlns:w16="http://schemas.microsoft.com/office/word/2018/wordml" xmlns:w16du="http://schemas.microsoft.com/office/word/2023/wordml/word16du" xmlns:w16sdtdh="http://schemas.microsoft.com/office/word/2020/wordml/sdtdatahash" xmlns:w16sdtfl="http://schemas.microsoft.com/office/word/2024/wordml/sdtformatlock" xmlns:w16se="http://schemas.microsoft.com/office/word/2015/wordml/symex" xmlns:wpg="http://schemas.microsoft.com/office/word/2010/wordprocessingGroup" xmlns:wpi="http://schemas.microsoft.com/office/word/2010/wordprocessingInk" xmlns:wne="http://schemas.microsoft.com/office/word/2006/wordml" xmlns:wps="http://schemas.microsoft.com/office/word/2010/wordprocessingShape" mc:Ignorable="w14 w15 w16se w16cid w16 w16cex w16sdtdh w16sdtfl w16du wp14">
   <w:footnote w:type="separator" w:id="-1">
     <w:p>
       <w:pPr>
@@ -10044,7 +10333,7 @@
 </file>
 
 <file path=word/header1.xml><?xml version="1.0" encoding="utf-8"?>
-<w:hdr xmlns:wpc="http://schemas.microsoft.com/office/word/2010/wordprocessingCanvas" xmlns:cx="http://schemas.microsoft.com/office/drawing/2014/chartex" xmlns:cx1="http://schemas.microsoft.com/office/drawing/2015/9/8/chartex" xmlns:cx2="http://schemas.microsoft.com/office/drawing/2015/10/21/chartex" xmlns:cx3="http://schemas.microsoft.com/office/drawing/2016/5/9/chartex" xmlns:cx4="http://schemas.microsoft.com/office/drawing/2016/5/10/chartex" xmlns:cx5="http://schemas.microsoft.com/office/drawing/2016/5/11/chartex" xmlns:cx6="http://schemas.microsoft.com/office/drawing/2016/5/12/chartex" xmlns:cx7="http://schemas.microsoft.com/office/drawing/2016/5/13/chartex" xmlns:cx8="http://schemas.microsoft.com/office/drawing/2016/5/14/chartex" xmlns:mc="http://schemas.openxmlformats.org/markup-compatibility/2006" xmlns:aink="http://schemas.microsoft.com/office/drawing/2016/ink" xmlns:am3d="http://schemas.microsoft.com/office/drawing/2017/model3d" xmlns:o="urn:schemas-microsoft-com:office:office" xmlns:oel="http://schemas.microsoft.com/office/2019/extlst" xmlns:r="http://schemas.openxmlformats.org/officeDocument/2006/relationships" xmlns:m="http://schemas.openxmlformats.org/officeDocument/2006/math" xmlns:v="urn:schemas-microsoft-com:vml" xmlns:wp14="http://schemas.microsoft.com/office/word/2010/wordprocessingDrawing" xmlns:wp="http://schemas.openxmlformats.org/drawingml/2006/wordprocessingDrawing" xmlns:w10="urn:schemas-microsoft-com:office:word" xmlns:w="http://schemas.openxmlformats.org/wordprocessingml/2006/main" xmlns:w14="http://schemas.microsoft.com/office/word/2010/wordml" xmlns:w15="http://schemas.microsoft.com/office/word/2012/wordml" xmlns:w16cex="http://schemas.microsoft.com/office/word/2018/wordml/cex" xmlns:w16cid="http://schemas.microsoft.com/office/word/2016/wordml/cid" xmlns:w16="http://schemas.microsoft.com/office/word/2018/wordml" xmlns:w16du="http://schemas.microsoft.com/office/word/2023/wordml/word16du" xmlns:w16sdtdh="http://schemas.microsoft.com/office/word/2020/wordml/sdtdatahash" xmlns:w16se="http://schemas.microsoft.com/office/word/2015/wordml/symex" xmlns:wpg="http://schemas.microsoft.com/office/word/2010/wordprocessingGroup" xmlns:wpi="http://schemas.microsoft.com/office/word/2010/wordprocessingInk" xmlns:wne="http://schemas.microsoft.com/office/word/2006/wordml" xmlns:wps="http://schemas.microsoft.com/office/word/2010/wordprocessingShape" mc:Ignorable="w14 w15 w16se w16cid w16 w16cex w16sdtdh w16du wp14">
+<w:hdr xmlns:wpc="http://schemas.microsoft.com/office/word/2010/wordprocessingCanvas" xmlns:cx="http://schemas.microsoft.com/office/drawing/2014/chartex" xmlns:cx1="http://schemas.microsoft.com/office/drawing/2015/9/8/chartex" xmlns:cx2="http://schemas.microsoft.com/office/drawing/2015/10/21/chartex" xmlns:cx3="http://schemas.microsoft.com/office/drawing/2016/5/9/chartex" xmlns:cx4="http://schemas.microsoft.com/office/drawing/2016/5/10/chartex" xmlns:cx5="http://schemas.microsoft.com/office/drawing/2016/5/11/chartex" xmlns:cx6="http://schemas.microsoft.com/office/drawing/2016/5/12/chartex" xmlns:cx7="http://schemas.microsoft.com/office/drawing/2016/5/13/chartex" xmlns:cx8="http://schemas.microsoft.com/office/drawing/2016/5/14/chartex" xmlns:mc="http://schemas.openxmlformats.org/markup-compatibility/2006" xmlns:aink="http://schemas.microsoft.com/office/drawing/2016/ink" xmlns:am3d="http://schemas.microsoft.com/office/drawing/2017/model3d" xmlns:o="urn:schemas-microsoft-com:office:office" xmlns:oel="http://schemas.microsoft.com/office/2019/extlst" xmlns:r="http://schemas.openxmlformats.org/officeDocument/2006/relationships" xmlns:m="http://schemas.openxmlformats.org/officeDocument/2006/math" xmlns:v="urn:schemas-microsoft-com:vml" xmlns:wp14="http://schemas.microsoft.com/office/word/2010/wordprocessingDrawing" xmlns:wp="http://schemas.openxmlformats.org/drawingml/2006/wordprocessingDrawing" xmlns:w10="urn:schemas-microsoft-com:office:word" xmlns:w="http://schemas.openxmlformats.org/wordprocessingml/2006/main" xmlns:w14="http://schemas.microsoft.com/office/word/2010/wordml" xmlns:w15="http://schemas.microsoft.com/office/word/2012/wordml" xmlns:w16cex="http://schemas.microsoft.com/office/word/2018/wordml/cex" xmlns:w16cid="http://schemas.microsoft.com/office/word/2016/wordml/cid" xmlns:w16="http://schemas.microsoft.com/office/word/2018/wordml" xmlns:w16du="http://schemas.microsoft.com/office/word/2023/wordml/word16du" xmlns:w16sdtdh="http://schemas.microsoft.com/office/word/2020/wordml/sdtdatahash" xmlns:w16sdtfl="http://schemas.microsoft.com/office/word/2024/wordml/sdtformatlock" xmlns:w16se="http://schemas.microsoft.com/office/word/2015/wordml/symex" xmlns:wpg="http://schemas.microsoft.com/office/word/2010/wordprocessingGroup" xmlns:wpi="http://schemas.microsoft.com/office/word/2010/wordprocessingInk" xmlns:wne="http://schemas.microsoft.com/office/word/2006/wordml" xmlns:wps="http://schemas.microsoft.com/office/word/2010/wordprocessingShape" mc:Ignorable="w14 w15 w16se w16cid w16 w16cex w16sdtdh w16sdtfl w16du wp14">
   <w:tbl>
     <w:tblPr>
       <w:tblStyle w:val="Tablaconcuadrcula"/>
@@ -10182,23 +10471,13 @@
             </w:rPr>
             <w:t xml:space="preserve">{{ </w:t>
           </w:r>
-          <w:proofErr w:type="spellStart"/>
           <w:r>
             <w:rPr>
               <w:b/>
               <w:sz w:val="18"/>
               <w:szCs w:val="18"/>
             </w:rPr>
-            <w:t>nombre_comercial</w:t>
-          </w:r>
-          <w:proofErr w:type="spellEnd"/>
-          <w:r>
-            <w:rPr>
-              <w:b/>
-              <w:sz w:val="18"/>
-              <w:szCs w:val="18"/>
-            </w:rPr>
-            <w:t xml:space="preserve"> }}</w:t>
+            <w:t>nombre_comercial }}</w:t>
           </w:r>
         </w:p>
         <w:p>
@@ -10218,43 +10497,7 @@
               <w:sz w:val="18"/>
               <w:szCs w:val="18"/>
             </w:rPr>
-            <w:t xml:space="preserve">{{ </w:t>
-          </w:r>
-          <w:proofErr w:type="spellStart"/>
-          <w:r>
-            <w:rPr>
-              <w:b/>
-              <w:sz w:val="18"/>
-              <w:szCs w:val="18"/>
-            </w:rPr>
-            <w:t>dia</w:t>
-          </w:r>
-          <w:proofErr w:type="spellEnd"/>
-          <w:r>
-            <w:rPr>
-              <w:b/>
-              <w:sz w:val="18"/>
-              <w:szCs w:val="18"/>
-            </w:rPr>
-            <w:t xml:space="preserve"> }} DE {{ mes }} DE {{ </w:t>
-          </w:r>
-          <w:proofErr w:type="spellStart"/>
-          <w:r>
-            <w:rPr>
-              <w:b/>
-              <w:sz w:val="18"/>
-              <w:szCs w:val="18"/>
-            </w:rPr>
-            <w:t>anio</w:t>
-          </w:r>
-          <w:proofErr w:type="spellEnd"/>
-          <w:r>
-            <w:rPr>
-              <w:b/>
-              <w:sz w:val="18"/>
-              <w:szCs w:val="18"/>
-            </w:rPr>
-            <w:t xml:space="preserve"> }}</w:t>
+            <w:t>{{ dia }} DE {{ mes }} DE {{ anio }}</w:t>
           </w:r>
           <w:bookmarkEnd w:id="9"/>
         </w:p>
@@ -10279,25 +10522,7 @@
               <w:sz w:val="18"/>
               <w:szCs w:val="18"/>
             </w:rPr>
-            <w:t xml:space="preserve">{{ </w:t>
-          </w:r>
-          <w:proofErr w:type="spellStart"/>
-          <w:r>
-            <w:rPr>
-              <w:b/>
-              <w:sz w:val="18"/>
-              <w:szCs w:val="18"/>
-            </w:rPr>
-            <w:t>registro_perito</w:t>
-          </w:r>
-          <w:proofErr w:type="spellEnd"/>
-          <w:r>
-            <w:rPr>
-              <w:b/>
-              <w:sz w:val="18"/>
-              <w:szCs w:val="18"/>
-            </w:rPr>
-            <w:t xml:space="preserve"> }}</w:t>
+            <w:t>{{ registro_perito }}</w:t>
           </w:r>
         </w:p>
         <w:p>
@@ -10316,25 +10541,7 @@
               <w:sz w:val="18"/>
               <w:szCs w:val="18"/>
             </w:rPr>
-            <w:t xml:space="preserve">{{ </w:t>
-          </w:r>
-          <w:proofErr w:type="spellStart"/>
-          <w:r>
-            <w:rPr>
-              <w:b/>
-              <w:sz w:val="18"/>
-              <w:szCs w:val="18"/>
-            </w:rPr>
-            <w:t>no_registro</w:t>
-          </w:r>
-          <w:proofErr w:type="spellEnd"/>
-          <w:r>
-            <w:rPr>
-              <w:b/>
-              <w:sz w:val="18"/>
-              <w:szCs w:val="18"/>
-            </w:rPr>
-            <w:t xml:space="preserve"> }}</w:t>
+            <w:t>{{ no_registro }}</w:t>
           </w:r>
         </w:p>
       </w:tc>
@@ -10349,7 +10556,7 @@
 </file>
 
 <file path=word/numbering.xml><?xml version="1.0" encoding="utf-8"?>
-<w:numbering xmlns:wpc="http://schemas.microsoft.com/office/word/2010/wordprocessingCanvas" xmlns:cx="http://schemas.microsoft.com/office/drawing/2014/chartex" xmlns:cx1="http://schemas.microsoft.com/office/drawing/2015/9/8/chartex" xmlns:cx2="http://schemas.microsoft.com/office/drawing/2015/10/21/chartex" xmlns:cx3="http://schemas.microsoft.com/office/drawing/2016/5/9/chartex" xmlns:cx4="http://schemas.microsoft.com/office/drawing/2016/5/10/chartex" xmlns:cx5="http://schemas.microsoft.com/office/drawing/2016/5/11/chartex" xmlns:cx6="http://schemas.microsoft.com/office/drawing/2016/5/12/chartex" xmlns:cx7="http://schemas.microsoft.com/office/drawing/2016/5/13/chartex" xmlns:cx8="http://schemas.microsoft.com/office/drawing/2016/5/14/chartex" xmlns:mc="http://schemas.openxmlformats.org/markup-compatibility/2006" xmlns:aink="http://schemas.microsoft.com/office/drawing/2016/ink" xmlns:am3d="http://schemas.microsoft.com/office/drawing/2017/model3d" xmlns:o="urn:schemas-microsoft-com:office:office" xmlns:oel="http://schemas.microsoft.com/office/2019/extlst" xmlns:r="http://schemas.openxmlformats.org/officeDocument/2006/relationships" xmlns:m="http://schemas.openxmlformats.org/officeDocument/2006/math" xmlns:v="urn:schemas-microsoft-com:vml" xmlns:wp14="http://schemas.microsoft.com/office/word/2010/wordprocessingDrawing" xmlns:wp="http://schemas.openxmlformats.org/drawingml/2006/wordprocessingDrawing" xmlns:w10="urn:schemas-microsoft-com:office:word" xmlns:w="http://schemas.openxmlformats.org/wordprocessingml/2006/main" xmlns:w14="http://schemas.microsoft.com/office/word/2010/wordml" xmlns:w15="http://schemas.microsoft.com/office/word/2012/wordml" xmlns:w16cex="http://schemas.microsoft.com/office/word/2018/wordml/cex" xmlns:w16cid="http://schemas.microsoft.com/office/word/2016/wordml/cid" xmlns:w16="http://schemas.microsoft.com/office/word/2018/wordml" xmlns:w16du="http://schemas.microsoft.com/office/word/2023/wordml/word16du" xmlns:w16sdtdh="http://schemas.microsoft.com/office/word/2020/wordml/sdtdatahash" xmlns:w16se="http://schemas.microsoft.com/office/word/2015/wordml/symex" xmlns:wpg="http://schemas.microsoft.com/office/word/2010/wordprocessingGroup" xmlns:wpi="http://schemas.microsoft.com/office/word/2010/wordprocessingInk" xmlns:wne="http://schemas.microsoft.com/office/word/2006/wordml" xmlns:wps="http://schemas.microsoft.com/office/word/2010/wordprocessingShape" mc:Ignorable="w14 w15 w16se w16cid w16 w16cex w16sdtdh w16du wp14">
+<w:numbering xmlns:wpc="http://schemas.microsoft.com/office/word/2010/wordprocessingCanvas" xmlns:cx="http://schemas.microsoft.com/office/drawing/2014/chartex" xmlns:cx1="http://schemas.microsoft.com/office/drawing/2015/9/8/chartex" xmlns:cx2="http://schemas.microsoft.com/office/drawing/2015/10/21/chartex" xmlns:cx3="http://schemas.microsoft.com/office/drawing/2016/5/9/chartex" xmlns:cx4="http://schemas.microsoft.com/office/drawing/2016/5/10/chartex" xmlns:cx5="http://schemas.microsoft.com/office/drawing/2016/5/11/chartex" xmlns:cx6="http://schemas.microsoft.com/office/drawing/2016/5/12/chartex" xmlns:cx7="http://schemas.microsoft.com/office/drawing/2016/5/13/chartex" xmlns:cx8="http://schemas.microsoft.com/office/drawing/2016/5/14/chartex" xmlns:mc="http://schemas.openxmlformats.org/markup-compatibility/2006" xmlns:aink="http://schemas.microsoft.com/office/drawing/2016/ink" xmlns:am3d="http://schemas.microsoft.com/office/drawing/2017/model3d" xmlns:o="urn:schemas-microsoft-com:office:office" xmlns:oel="http://schemas.microsoft.com/office/2019/extlst" xmlns:r="http://schemas.openxmlformats.org/officeDocument/2006/relationships" xmlns:m="http://schemas.openxmlformats.org/officeDocument/2006/math" xmlns:v="urn:schemas-microsoft-com:vml" xmlns:wp14="http://schemas.microsoft.com/office/word/2010/wordprocessingDrawing" xmlns:wp="http://schemas.openxmlformats.org/drawingml/2006/wordprocessingDrawing" xmlns:w10="urn:schemas-microsoft-com:office:word" xmlns:w="http://schemas.openxmlformats.org/wordprocessingml/2006/main" xmlns:w14="http://schemas.microsoft.com/office/word/2010/wordml" xmlns:w15="http://schemas.microsoft.com/office/word/2012/wordml" xmlns:w16cex="http://schemas.microsoft.com/office/word/2018/wordml/cex" xmlns:w16cid="http://schemas.microsoft.com/office/word/2016/wordml/cid" xmlns:w16="http://schemas.microsoft.com/office/word/2018/wordml" xmlns:w16du="http://schemas.microsoft.com/office/word/2023/wordml/word16du" xmlns:w16sdtdh="http://schemas.microsoft.com/office/word/2020/wordml/sdtdatahash" xmlns:w16sdtfl="http://schemas.microsoft.com/office/word/2024/wordml/sdtformatlock" xmlns:w16se="http://schemas.microsoft.com/office/word/2015/wordml/symex" xmlns:wpg="http://schemas.microsoft.com/office/word/2010/wordprocessingGroup" xmlns:wpi="http://schemas.microsoft.com/office/word/2010/wordprocessingInk" xmlns:wne="http://schemas.microsoft.com/office/word/2006/wordml" xmlns:wps="http://schemas.microsoft.com/office/word/2010/wordprocessingShape" mc:Ignorable="w14 w15 w16se w16cid w16 w16cex w16sdtdh w16sdtfl w16du wp14">
   <w:abstractNum w:abstractNumId="0" w15:restartNumberingAfterBreak="0">
     <w:nsid w:val="0011328B"/>
     <w:multiLevelType w:val="hybridMultilevel"/>
@@ -13315,7 +13522,7 @@
 </file>
 
 <file path=word/styles.xml><?xml version="1.0" encoding="utf-8"?>
-<w:styles xmlns:mc="http://schemas.openxmlformats.org/markup-compatibility/2006" xmlns:r="http://schemas.openxmlformats.org/officeDocument/2006/relationships" xmlns:w="http://schemas.openxmlformats.org/wordprocessingml/2006/main" xmlns:w14="http://schemas.microsoft.com/office/word/2010/wordml" xmlns:w15="http://schemas.microsoft.com/office/word/2012/wordml" xmlns:w16cex="http://schemas.microsoft.com/office/word/2018/wordml/cex" xmlns:w16cid="http://schemas.microsoft.com/office/word/2016/wordml/cid" xmlns:w16="http://schemas.microsoft.com/office/word/2018/wordml" xmlns:w16du="http://schemas.microsoft.com/office/word/2023/wordml/word16du" xmlns:w16sdtdh="http://schemas.microsoft.com/office/word/2020/wordml/sdtdatahash" xmlns:w16se="http://schemas.microsoft.com/office/word/2015/wordml/symex" mc:Ignorable="w14 w15 w16se w16cid w16 w16cex w16sdtdh w16du">
+<w:styles xmlns:mc="http://schemas.openxmlformats.org/markup-compatibility/2006" xmlns:r="http://schemas.openxmlformats.org/officeDocument/2006/relationships" xmlns:w="http://schemas.openxmlformats.org/wordprocessingml/2006/main" xmlns:w14="http://schemas.microsoft.com/office/word/2010/wordml" xmlns:w15="http://schemas.microsoft.com/office/word/2012/wordml" xmlns:w16cex="http://schemas.microsoft.com/office/word/2018/wordml/cex" xmlns:w16cid="http://schemas.microsoft.com/office/word/2016/wordml/cid" xmlns:w16="http://schemas.microsoft.com/office/word/2018/wordml" xmlns:w16du="http://schemas.microsoft.com/office/word/2023/wordml/word16du" xmlns:w16sdtdh="http://schemas.microsoft.com/office/word/2020/wordml/sdtdatahash" xmlns:w16sdtfl="http://schemas.microsoft.com/office/word/2024/wordml/sdtformatlock" xmlns:w16se="http://schemas.microsoft.com/office/word/2015/wordml/symex" mc:Ignorable="w14 w15 w16se w16cid w16 w16cex w16sdtdh w16sdtfl w16du">
   <w:docDefaults>
     <w:rPrDefault>
       <w:rPr>

</xml_diff>